<commit_message>
Add TMDB movie and poster integration
</commit_message>
<xml_diff>
--- a/docs/Codebase Map.docx
+++ b/docs/Codebase Map.docx
@@ -7,623 +7,312 @@
         <w:spacing w:after="200" w:line="276" w:lineRule="auto"/>
       </w:pPr>
       <w:r>
-        <w:rPr>
-          <w:rFonts w:ascii="Calibri" w:hAnsi="Calibri" w:eastAsia="ＭＳ 明朝" w:cs="Calibri" w:eastAsiaTheme="minorEastAsia" w:csTheme="minorBidi"/>
-          <w:b/>
-          <w:bCs/>
-          <w:sz w:val="36"/>
-          <w:szCs w:val="22"/>
-        </w:rPr>
-        <w:t>Major Web Application Project - Codebase Map Template</w:t>
+        <w:t>Major Web Application Project — Codebase Map</w:t>
       </w:r>
     </w:p>
     <w:p>
       <w:pPr>
-        <w:spacing w:after="200" w:line="276" w:lineRule="auto"/>
+        <w:pStyle w:val="Heading2"/>
+        <w:outlineLvl w:val="1"/>
       </w:pPr>
       <w:r>
+        <w:t>Name and Student Number</w:t>
+      </w:r>
+    </w:p>
+    <w:p>
+      <w:r>
         <w:rPr>
-          <w:rFonts w:ascii="Calibri" w:hAnsi="Calibri" w:eastAsia="ＭＳ 明朝" w:cs="Calibri" w:eastAsiaTheme="minorEastAsia" w:csTheme="minorBidi"/>
-          <w:i/>
-          <w:iCs/>
-          <w:sz w:val="22"/>
-          <w:szCs w:val="22"/>
+          <w:b/>
+          <w:bCs/>
         </w:rPr>
-        <w:t>Fill this in and submit it with your project as your Codebase Map (PDF). The narrative sections should fit on about 1 page; the feature table below does NOT count toward that page limit.</w:t>
+        <w:t>Name:</w:t>
+      </w:r>
+      <w:r>
+        <w:t xml:space="preserve"> Yuehui Chen</w:t>
+      </w:r>
+      <w:r>
+        <w:br w:type="textWrapping"/>
+      </w:r>
+      <w:r>
+        <w:rPr>
+          <w:b/>
+          <w:bCs/>
+        </w:rPr>
+        <w:t>Student Number:</w:t>
+      </w:r>
+      <w:r>
+        <w:t xml:space="preserve"> S5361257</w:t>
       </w:r>
     </w:p>
     <w:p>
       <w:pPr>
-        <w:pStyle w:val="Heading1"/>
+        <w:pStyle w:val="Heading2"/>
+        <w:outlineLvl w:val="1"/>
       </w:pPr>
       <w:r>
-        <w:rPr>
-          <w:rFonts w:ascii="Calibri" w:hAnsi="Calibri" w:eastAsia="ＭＳ ゴシック" w:cs="Calibri" w:asciiTheme="majorHAnsi" w:hAnsiTheme="majorHAnsi" w:eastAsiaTheme="majorEastAsia" w:csTheme="majorBidi"/>
-          <w:b/>
-          <w:bCs/>
-          <w:color w:val="365F91" w:themeColor="accent1" w:themeShade="BF"/>
-          <w:sz w:val="28"/>
-          <w:szCs w:val="28"/>
-        </w:rPr>
-        <w:t>Name and Student Number:</w:t>
-      </w:r>
-    </w:p>
-    <w:p>
-      <w:pPr>
-        <w:spacing w:after="200" w:line="276" w:lineRule="auto"/>
-      </w:pPr>
-    </w:p>
-    <w:p>
-      <w:pPr>
-        <w:spacing w:after="200" w:line="276" w:lineRule="auto"/>
-      </w:pPr>
-      <w:r>
-        <w:rPr>
-          <w:rFonts w:ascii="Calibri" w:cs="Calibri"/>
-          <w:sz w:val="22"/>
-          <w:szCs w:val="22"/>
-        </w:rPr>
-        <w:t>**Name:** Yuehui Chen</w:t>
-      </w:r>
-    </w:p>
-    <w:p>
-      <w:pPr>
-        <w:spacing w:after="200" w:line="276" w:lineRule="auto"/>
-      </w:pPr>
-      <w:r>
-        <w:rPr>
-          <w:rFonts w:ascii="Calibri" w:hAnsi="Calibri" w:eastAsia="ＭＳ 明朝" w:cs="Calibri" w:eastAsiaTheme="minorEastAsia"/>
-          <w:sz w:val="22"/>
-          <w:szCs w:val="22"/>
-        </w:rPr>
-        <w:t>**Student Number:** S5361257</w:t>
-      </w:r>
-    </w:p>
-    <w:p>
-      <w:pPr>
-        <w:pStyle w:val="Heading1"/>
-      </w:pPr>
-      <w:r>
-        <w:rPr>
-          <w:rFonts w:ascii="Calibri" w:hAnsi="Calibri" w:eastAsia="ＭＳ ゴシック" w:cs="Calibri" w:asciiTheme="majorHAnsi" w:hAnsiTheme="majorHAnsi" w:eastAsiaTheme="majorEastAsia" w:csTheme="majorBidi"/>
-          <w:b/>
-          <w:bCs/>
-          <w:color w:val="365F91" w:themeColor="accent1" w:themeShade="BF"/>
-          <w:sz w:val="28"/>
-          <w:szCs w:val="28"/>
-        </w:rPr>
         <w:t>Summary</w:t>
       </w:r>
     </w:p>
     <w:p>
       <w:pPr>
-        <w:spacing w:after="200" w:line="276" w:lineRule="auto"/>
+        <w:pStyle w:val="Heading3"/>
+        <w:outlineLvl w:val="2"/>
       </w:pPr>
       <w:r>
-        <w:rPr>
-          <w:rFonts w:ascii="Calibri" w:hAnsi="Calibri" w:eastAsia="ＭＳ 明朝" w:cs="Calibri" w:eastAsiaTheme="minorEastAsia" w:csTheme="minorBidi"/>
-          <w:b/>
-          <w:bCs/>
-          <w:sz w:val="22"/>
-          <w:szCs w:val="22"/>
-        </w:rPr>
-        <w:t>App purpose (one sentence - “This app helps [who] to [do what]”):</w:t>
+        <w:t>App purpose</w:t>
       </w:r>
     </w:p>
     <w:p>
-      <w:pPr>
-        <w:spacing w:after="200" w:line="276" w:lineRule="auto"/>
-      </w:pPr>
       <w:r>
         <w:t>CineTrack helps movie fans discover movies, read reviews, and create and manage their own movie reviews.</w:t>
       </w:r>
     </w:p>
     <w:p>
       <w:pPr>
-        <w:spacing w:after="200" w:line="276" w:lineRule="auto"/>
+        <w:pStyle w:val="Heading3"/>
+        <w:outlineLvl w:val="2"/>
       </w:pPr>
       <w:r>
+        <w:t>Target grade and resulting Complexity total</w:t>
+      </w:r>
+    </w:p>
+    <w:p>
+      <w:r>
         <w:rPr>
-          <w:rFonts w:ascii="Calibri" w:hAnsi="Calibri" w:eastAsia="ＭＳ 明朝" w:cs="Calibri" w:eastAsiaTheme="minorEastAsia" w:csTheme="minorBidi"/>
           <w:b/>
           <w:bCs/>
-          <w:sz w:val="22"/>
-          <w:szCs w:val="22"/>
         </w:rPr>
-        <w:t>Target grade and resulting Complexity total (core points earned + features claimed):</w:t>
+        <w:t>Target grade:</w:t>
+      </w:r>
+      <w:r>
+        <w:t xml:space="preserve"> 0.90 planned</w:t>
+      </w:r>
+    </w:p>
+    <w:p>
+      <w:r>
+        <w:rPr>
+          <w:b/>
+          <w:bCs/>
+        </w:rPr>
+        <w:t>Current Complexity total:</w:t>
+      </w:r>
+      <w:r>
+        <w:t xml:space="preserve"> </w:t>
+      </w:r>
+      <w:r>
+        <w:rPr>
+          <w:b/>
+          <w:bCs/>
+        </w:rPr>
+        <w:t>0.92</w:t>
+      </w:r>
+    </w:p>
+    <w:p>
+      <w:r>
+        <w:rPr>
+          <w:b/>
+          <w:bCs/>
+        </w:rPr>
+        <w:t>Core requirements claimed:</w:t>
+      </w:r>
+    </w:p>
+    <w:p>
+      <w:r>
+        <w:t>#1 Authentication</w:t>
+      </w:r>
+    </w:p>
+    <w:p>
+      <w:r>
+        <w:t>#2 3+ related tables</w:t>
+      </w:r>
+    </w:p>
+    <w:p>
+      <w:r>
+        <w:t>#3 Full CRUD</w:t>
+      </w:r>
+    </w:p>
+    <w:p>
+      <w:r>
+        <w:t>#4 Server-side validation</w:t>
+      </w:r>
+    </w:p>
+    <w:p>
+      <w:r>
+        <w:t>#5 Ownership authorization</w:t>
+      </w:r>
+    </w:p>
+    <w:p>
+      <w:r>
+        <w:rPr>
+          <w:b/>
+          <w:bCs/>
+        </w:rPr>
+        <w:t>Features claimed:</w:t>
+      </w:r>
+    </w:p>
+    <w:p>
+      <w:r>
+        <w:t>#6 Image/file upload</w:t>
+      </w:r>
+    </w:p>
+    <w:p>
+      <w:r>
+        <w:t>#7 Search/filter + pagination</w:t>
+      </w:r>
+    </w:p>
+    <w:p>
+      <w:r>
+        <w:t>#8 Coherent &amp; usable app</w:t>
+      </w:r>
+    </w:p>
+    <w:p>
+      <w:r>
+        <w:t>#9 4th related table</w:t>
+      </w:r>
+    </w:p>
+    <w:p>
+      <w:r>
+        <w:t>#11 Many-to-many</w:t>
+      </w:r>
+    </w:p>
+    <w:p>
+      <w:r>
+        <w:t>#12 Roles + middleware</w:t>
+      </w:r>
+    </w:p>
+    <w:p>
+      <w:r>
+        <w:t>Features #10, #13, #14 and #15 are not currently claimed.</w:t>
       </w:r>
     </w:p>
     <w:p>
       <w:pPr>
-        <w:spacing w:after="200" w:line="276" w:lineRule="auto"/>
+        <w:pStyle w:val="Heading2"/>
+        <w:outlineLvl w:val="1"/>
       </w:pPr>
       <w:r>
-        <w:rPr>
-          <w:rFonts w:ascii="Calibri" w:hAnsi="Calibri" w:eastAsia="ＭＳ 明朝" w:cs="Calibri" w:eastAsiaTheme="minorEastAsia" w:csTheme="minorBidi"/>
-          <w:b/>
-          <w:bCs/>
-          <w:sz w:val="22"/>
-          <w:szCs w:val="22"/>
-        </w:rPr>
-        <w:t>0.90 planned</w:t>
-      </w:r>
-      <w:r>
-        <w:rPr>
-          <w:rFonts w:ascii="Calibri" w:hAnsi="Calibri" w:eastAsia="ＭＳ 明朝" w:cs="Calibri" w:eastAsiaTheme="minorEastAsia" w:csTheme="minorBidi"/>
-          <w:sz w:val="22"/>
-          <w:szCs w:val="22"/>
-        </w:rPr>
-        <w:t xml:space="preserve"> </w:t>
+        <w:t>Proudest code</w:t>
       </w:r>
     </w:p>
     <w:p>
       <w:r>
-        <w:t>Core:</w:t>
+        <w:t>The feature I most want to be examined on is the movie review system and its ownership authorization.</w:t>
       </w:r>
     </w:p>
     <w:p>
       <w:r>
-        <w:t xml:space="preserve"> #1 Authentication</w:t>
+        <w:t>Reviews are linked to both users and movies, and each authenticated user can create, edit and delete only their own reviews. The review controller checks ownership before allowing update or deletion, while the database also prevents a user from reviewing the same movie more than once.</w:t>
       </w:r>
     </w:p>
     <w:p>
       <w:r>
-        <w:t xml:space="preserve"> #2 3+ related tables</w:t>
+        <w:rPr>
+          <w:b/>
+          <w:bCs/>
+        </w:rPr>
+        <w:t>Main locations:</w:t>
       </w:r>
     </w:p>
     <w:p>
       <w:r>
-        <w:t xml:space="preserve"> #3 Full CRUD</w:t>
+        <w:t>app/Http/Controllers/ReviewController.php</w:t>
       </w:r>
     </w:p>
     <w:p>
       <w:r>
-        <w:t xml:space="preserve"> #4 Server-side validation</w:t>
+        <w:t>app/Models/Review.php</w:t>
       </w:r>
     </w:p>
     <w:p>
       <w:r>
-        <w:t xml:space="preserve"> #5 Ownership authorization</w:t>
-      </w:r>
-    </w:p>
-    <w:p/>
-    <w:p>
-      <w:r>
-        <w:t>Features:</w:t>
+        <w:t>database/migrations/*create_reviews_table.php</w:t>
       </w:r>
     </w:p>
     <w:p>
       <w:r>
-        <w:t xml:space="preserve"> #7 Search/filter + pagination</w:t>
+        <w:t>resources/views/reviews/</w:t>
       </w:r>
     </w:p>
     <w:p>
       <w:r>
-        <w:t xml:space="preserve"> #9 4th related table</w:t>
+        <w:t>resources/views/my-reviews.blade.php</w:t>
+      </w:r>
+    </w:p>
+    <w:p>
+      <w:pPr>
+        <w:pStyle w:val="Heading2"/>
+        <w:outlineLvl w:val="1"/>
+      </w:pPr>
+      <w:r>
+        <w:t>AI log</w:t>
       </w:r>
     </w:p>
     <w:p>
       <w:r>
-        <w:t xml:space="preserve"> #11 Many-to-many</w:t>
+        <w:t>AI helped most with planning the Laravel structure, debugging implementation problems, improving Blade/Tailwind layouts, and checking relationships between controllers, models, migrations and views.</w:t>
       </w:r>
     </w:p>
     <w:p>
       <w:r>
-        <w:t xml:space="preserve"> #12 Roles + middleware</w:t>
+        <w:t>One concrete example where AI produced a problem was the movie deletion relationship. An incorrect migration method, casecadeOnDelete(), was identified and corrected to cascadeOnDelete(). The database was then recreated and tested to confirm that deleting a movie correctly cascades to its reviews.</w:t>
       </w:r>
     </w:p>
     <w:p>
       <w:r>
-        <w:t xml:space="preserve"> #15 Third-party API</w:t>
+        <w:t>Another example was the movie poster display. An initial image layout caused portrait posters to extend beyond their intended container. The image/container sizing was then tested and adjusted while preserving the poster's original aspect ratio.</w:t>
       </w:r>
     </w:p>
     <w:p>
       <w:pPr>
-        <w:spacing w:after="200" w:line="276" w:lineRule="auto"/>
+        <w:pStyle w:val="Heading2"/>
+        <w:outlineLvl w:val="1"/>
       </w:pPr>
       <w:r>
-        <w:rPr>
-          <w:rFonts w:ascii="Calibri" w:hAnsi="Calibri" w:eastAsia="ＭＳ 明朝" w:cs="Calibri" w:eastAsiaTheme="minorEastAsia" w:csTheme="minorBidi"/>
-          <w:sz w:val="22"/>
-          <w:szCs w:val="22"/>
-        </w:rPr>
-        <w:t>______________________________________________________________________</w:t>
-      </w:r>
-    </w:p>
-    <w:p>
-      <w:pPr>
-        <w:pStyle w:val="Heading1"/>
-      </w:pPr>
-      <w:r>
-        <w:rPr>
-          <w:rFonts w:ascii="Calibri" w:hAnsi="Calibri" w:eastAsia="ＭＳ ゴシック" w:cs="Calibri" w:asciiTheme="majorHAnsi" w:hAnsiTheme="majorHAnsi" w:eastAsiaTheme="majorEastAsia" w:csTheme="majorBidi"/>
-          <w:b/>
-          <w:bCs/>
-          <w:color w:val="365F91" w:themeColor="accent1" w:themeShade="BF"/>
-          <w:sz w:val="28"/>
-          <w:szCs w:val="28"/>
-        </w:rPr>
-        <w:t>Proudest code</w:t>
-      </w:r>
-    </w:p>
-    <w:p>
-      <w:pPr>
-        <w:spacing w:after="200" w:line="276" w:lineRule="auto"/>
-      </w:pPr>
-      <w:r>
-        <w:rPr>
-          <w:rFonts w:ascii="Calibri" w:hAnsi="Calibri" w:eastAsia="ＭＳ 明朝" w:cs="Calibri" w:eastAsiaTheme="minorEastAsia" w:csTheme="minorBidi"/>
-          <w:b/>
-          <w:bCs/>
-          <w:sz w:val="22"/>
-          <w:szCs w:val="22"/>
-        </w:rPr>
-        <w:t>The one feature you most want to be examined on (and where it lives):</w:t>
-      </w:r>
-    </w:p>
-    <w:p>
-      <w:pPr>
-        <w:spacing w:after="200" w:line="276" w:lineRule="auto"/>
-      </w:pPr>
-      <w:r>
-        <w:rPr>
-          <w:rFonts w:ascii="Calibri" w:hAnsi="Calibri" w:eastAsia="ＭＳ 明朝" w:cs="Calibri" w:eastAsiaTheme="minorEastAsia" w:csTheme="minorBidi"/>
-          <w:sz w:val="22"/>
-          <w:szCs w:val="22"/>
-        </w:rPr>
-        <w:t>______________________________________________________________________</w:t>
-      </w:r>
-    </w:p>
-    <w:p>
-      <w:pPr>
-        <w:pStyle w:val="Heading1"/>
-      </w:pPr>
-      <w:r>
-        <w:rPr>
-          <w:rFonts w:ascii="Calibri" w:hAnsi="Calibri" w:eastAsia="ＭＳ ゴシック" w:cs="Calibri" w:asciiTheme="majorHAnsi" w:hAnsiTheme="majorHAnsi" w:eastAsiaTheme="majorEastAsia" w:csTheme="majorBidi"/>
-          <w:b/>
-          <w:bCs/>
-          <w:color w:val="365F91" w:themeColor="accent1" w:themeShade="BF"/>
-          <w:sz w:val="28"/>
-          <w:szCs w:val="28"/>
-        </w:rPr>
-        <w:t>AI log</w:t>
-      </w:r>
-    </w:p>
-    <w:p>
-      <w:pPr>
-        <w:spacing w:after="200" w:line="276" w:lineRule="auto"/>
-      </w:pPr>
-      <w:r>
-        <w:rPr>
-          <w:rFonts w:ascii="Calibri" w:hAnsi="Calibri" w:eastAsia="ＭＳ 明朝" w:cs="Calibri" w:eastAsiaTheme="minorEastAsia" w:csTheme="minorBidi"/>
-          <w:b/>
-          <w:bCs/>
-          <w:sz w:val="22"/>
-          <w:szCs w:val="22"/>
-        </w:rPr>
-        <w:t>Where AI helped you most, and one concrete instance where AI produced a bug or bad architecture that you found and fixed:</w:t>
-      </w:r>
-    </w:p>
-    <w:p>
-      <w:pPr>
-        <w:spacing w:after="200" w:line="276" w:lineRule="auto"/>
-      </w:pPr>
-      <w:r>
-        <w:rPr>
-          <w:rFonts w:ascii="Calibri" w:hAnsi="Calibri" w:eastAsia="ＭＳ 明朝" w:cs="Calibri" w:eastAsiaTheme="minorEastAsia" w:csTheme="minorBidi"/>
-          <w:sz w:val="22"/>
-          <w:szCs w:val="22"/>
-        </w:rPr>
-        <w:t>______________________________________________________________________</w:t>
-      </w:r>
-    </w:p>
-    <w:p>
-      <w:pPr>
-        <w:spacing w:after="200" w:line="276" w:lineRule="auto"/>
-      </w:pPr>
-      <w:r>
-        <w:rPr>
-          <w:rFonts w:ascii="Calibri" w:hAnsi="Calibri" w:eastAsia="ＭＳ 明朝" w:cs="Calibri" w:eastAsiaTheme="minorEastAsia" w:csTheme="minorBidi"/>
-          <w:sz w:val="22"/>
-          <w:szCs w:val="22"/>
-        </w:rPr>
-        <w:t>______________________________________________________________________</w:t>
-      </w:r>
-    </w:p>
-    <w:p>
-      <w:pPr>
-        <w:pageBreakBefore/>
-        <w:spacing w:after="200" w:line="276" w:lineRule="auto"/>
-      </w:pPr>
-      <w:r>
-        <w:lastRenderedPageBreak/>
-      </w:r>
-    </w:p>
-    <w:p>
-      <w:pPr>
-        <w:pStyle w:val="Heading1"/>
-      </w:pPr>
-      <w:r>
-        <w:lastRenderedPageBreak/>
-        <w:rPr>
-          <w:rFonts w:ascii="Calibri" w:hAnsi="Calibri" w:eastAsia="ＭＳ ゴシック" w:cs="Calibri" w:asciiTheme="majorHAnsi" w:hAnsiTheme="majorHAnsi" w:eastAsiaTheme="majorEastAsia" w:csTheme="majorBidi"/>
-          <w:b/>
-          <w:bCs/>
-          <w:color w:val="365F91" w:themeColor="accent1" w:themeShade="BF"/>
-          <w:sz w:val="28"/>
-          <w:szCs w:val="28"/>
-        </w:rPr>
         <w:t>Feature table</w:t>
       </w:r>
     </w:p>
     <w:p>
       <w:pPr>
-        <w:spacing w:after="200" w:line="276" w:lineRule="auto"/>
+        <w:pStyle w:val="Heading3"/>
+        <w:outlineLvl w:val="2"/>
       </w:pPr>
       <w:r>
-        <w:rPr>
-          <w:rFonts w:ascii="Calibri" w:hAnsi="Calibri" w:eastAsia="ＭＳ 明朝" w:cs="Calibri" w:eastAsiaTheme="minorEastAsia" w:csTheme="minorBidi"/>
-          <w:sz w:val="22"/>
-          <w:szCs w:val="22"/>
-        </w:rPr>
-        <w:t xml:space="preserve">Indicate the completion status of each </w:t>
-      </w:r>
-      <w:r>
-        <w:rPr>
-          <w:rFonts w:ascii="Calibri" w:hAnsi="Calibri" w:eastAsia="ＭＳ 明朝" w:cs="Calibri" w:eastAsiaTheme="minorEastAsia" w:csTheme="minorBidi"/>
-          <w:sz w:val="22"/>
-          <w:szCs w:val="22"/>
-        </w:rPr>
-        <w:t>requirement and</w:t>
-      </w:r>
-      <w:r>
-        <w:rPr>
-          <w:rFonts w:ascii="Calibri" w:hAnsi="Calibri" w:eastAsia="ＭＳ 明朝" w:cs="Calibri" w:eastAsiaTheme="minorEastAsia" w:csTheme="minorBidi"/>
-          <w:sz w:val="22"/>
-          <w:szCs w:val="22"/>
-        </w:rPr>
-        <w:t xml:space="preserve"> </w:t>
-      </w:r>
-      <w:r>
-        <w:rPr>
-          <w:rFonts w:ascii="Calibri" w:hAnsi="Calibri" w:eastAsia="ＭＳ 明朝" w:cs="Calibri" w:eastAsiaTheme="minorEastAsia" w:csTheme="minorBidi"/>
-          <w:sz w:val="22"/>
-          <w:szCs w:val="22"/>
-        </w:rPr>
-        <w:t>give the location (</w:t>
-      </w:r>
-      <w:r>
-        <w:rPr>
-          <w:rFonts w:ascii="Calibri" w:hAnsi="Calibri" w:eastAsia="ＭＳ 明朝" w:cs="Calibri" w:eastAsiaTheme="minorEastAsia" w:csTheme="minorBidi"/>
-          <w:sz w:val="22"/>
-          <w:szCs w:val="22"/>
-        </w:rPr>
-        <w:t>file @</w:t>
-      </w:r>
-      <w:r>
-        <w:rPr>
-          <w:rFonts w:ascii="Calibri" w:hAnsi="Calibri" w:eastAsia="ＭＳ 明朝" w:cs="Calibri" w:eastAsiaTheme="minorEastAsia" w:csTheme="minorBidi"/>
-          <w:sz w:val="22"/>
-          <w:szCs w:val="22"/>
-        </w:rPr>
-        <w:t xml:space="preserve"> lines</w:t>
-      </w:r>
-      <w:r>
-        <w:rPr>
-          <w:rFonts w:ascii="Calibri" w:hAnsi="Calibri" w:eastAsia="ＭＳ 明朝" w:cs="Calibri" w:eastAsiaTheme="minorEastAsia" w:csTheme="minorBidi"/>
-          <w:sz w:val="22"/>
-          <w:szCs w:val="22"/>
-        </w:rPr>
-        <w:t>)</w:t>
-      </w:r>
-      <w:r>
-        <w:rPr>
-          <w:rFonts w:ascii="Calibri" w:hAnsi="Calibri" w:eastAsia="ＭＳ 明朝" w:cs="Calibri" w:eastAsiaTheme="minorEastAsia" w:csTheme="minorBidi"/>
-          <w:sz w:val="22"/>
-          <w:szCs w:val="22"/>
-        </w:rPr>
-        <w:t>, and</w:t>
-      </w:r>
-      <w:r>
-        <w:rPr>
-          <w:rFonts w:ascii="Calibri" w:hAnsi="Calibri" w:eastAsia="ＭＳ 明朝" w:cs="Calibri" w:eastAsiaTheme="minorEastAsia" w:csTheme="minorBidi"/>
-          <w:sz w:val="22"/>
-          <w:szCs w:val="22"/>
-        </w:rPr>
-        <w:t xml:space="preserve"> calculate the total score</w:t>
-      </w:r>
-      <w:r>
-        <w:rPr>
-          <w:rFonts w:ascii="Calibri" w:hAnsi="Calibri" w:eastAsia="ＭＳ 明朝" w:cs="Calibri" w:eastAsiaTheme="minorEastAsia" w:csTheme="minorBidi"/>
-          <w:sz w:val="22"/>
-          <w:szCs w:val="22"/>
-        </w:rPr>
-        <w:t xml:space="preserve"> for each table</w:t>
-      </w:r>
-      <w:r>
-        <w:rPr>
-          <w:rFonts w:ascii="Calibri" w:hAnsi="Calibri" w:eastAsia="ＭＳ 明朝" w:cs="Calibri" w:eastAsiaTheme="minorEastAsia" w:csTheme="minorBidi"/>
-          <w:sz w:val="22"/>
-          <w:szCs w:val="22"/>
-        </w:rPr>
-        <w:t>.</w:t>
+        <w:t>Core requirements</w:t>
       </w:r>
     </w:p>
     <w:tbl>
-      <w:tblPr>
-        <w:tblStyle w:val="TableGrid"/>
-        <w:tblW w:w="8755" w:type="dxa"/>
-        <w:tblBorders>
-          <w:top w:val="single" w:sz="4" w:space="0" w:color="auto"/>
-          <w:left w:val="single" w:sz="4" w:space="0" w:color="auto"/>
-          <w:bottom w:val="single" w:sz="4" w:space="0" w:color="auto"/>
-          <w:right w:val="single" w:sz="4" w:space="0" w:color="auto"/>
-          <w:insideH w:val="single" w:sz="4" w:space="0" w:color="auto"/>
-          <w:insideV w:val="single" w:sz="4" w:space="0" w:color="auto"/>
-        </w:tblBorders>
-        <w:tblLayout w:type="fixed"/>
-        <w:tblCellMar>
-          <w:top w:w="0" w:type="dxa"/>
-          <w:left w:w="108" w:type="dxa"/>
-          <w:bottom w:w="0" w:type="dxa"/>
-          <w:right w:w="108" w:type="dxa"/>
-        </w:tblCellMar>
-        <w:tblLook w:firstRow="1" w:firstColumn="1" w:noVBand="1"/>
-      </w:tblPr>
+      <w:tblPr/>
       <w:tblGrid>
-        <w:gridCol w:w="534"/>
-        <w:gridCol w:w="2230"/>
-        <w:gridCol w:w="4148"/>
-        <w:gridCol w:w="1843"/>
+        <w:gridCol w:w="2340"/>
+        <w:gridCol w:w="2340"/>
+        <w:gridCol w:w="2340"/>
+        <w:gridCol w:w="2340"/>
       </w:tblGrid>
       <w:tr>
         <w:tc>
-          <w:tcPr>
-            <w:tcW w:w="534" w:type="dxa"/>
-            <w:tcBorders>
-              <w:top w:val="single" w:sz="4" w:space="0" w:color="auto"/>
-              <w:left w:val="single" w:sz="4" w:space="0" w:color="auto"/>
-              <w:bottom w:val="single" w:sz="4" w:space="0" w:color="auto"/>
-              <w:right w:val="single" w:sz="4" w:space="0" w:color="auto"/>
-            </w:tcBorders>
-            <w:tcMar>
-              <w:top w:w="0" w:type="dxa"/>
-              <w:left w:w="108" w:type="dxa"/>
-              <w:bottom w:w="0" w:type="dxa"/>
-              <w:right w:w="108" w:type="dxa"/>
-            </w:tcMar>
-          </w:tcPr>
           <w:p>
-            <w:pPr>
-              <w:spacing w:after="200" w:line="276" w:lineRule="auto"/>
-            </w:pPr>
             <w:r>
-              <w:rPr>
-                <w:rFonts w:ascii="Calibri" w:hAnsi="Calibri" w:eastAsia="ＭＳ 明朝" w:cs="Calibri" w:eastAsiaTheme="minorEastAsia" w:csTheme="minorBidi"/>
-                <w:b/>
-                <w:bCs/>
-                <w:sz w:val="22"/>
-                <w:szCs w:val="22"/>
-              </w:rPr>
               <w:t>#</w:t>
             </w:r>
           </w:p>
         </w:tc>
         <w:tc>
-          <w:tcPr>
-            <w:tcW w:w="2230" w:type="dxa"/>
-            <w:tcBorders>
-              <w:top w:val="single" w:sz="4" w:space="0" w:color="auto"/>
-              <w:left w:val="single" w:sz="4" w:space="0" w:color="auto"/>
-              <w:bottom w:val="single" w:sz="4" w:space="0" w:color="auto"/>
-              <w:right w:val="single" w:sz="4" w:space="0" w:color="auto"/>
-            </w:tcBorders>
-            <w:tcMar>
-              <w:top w:w="0" w:type="dxa"/>
-              <w:left w:w="108" w:type="dxa"/>
-              <w:bottom w:w="0" w:type="dxa"/>
-              <w:right w:w="108" w:type="dxa"/>
-            </w:tcMar>
-          </w:tcPr>
           <w:p>
-            <w:pPr>
-              <w:spacing w:after="200" w:line="276" w:lineRule="auto"/>
-            </w:pPr>
             <w:r>
-              <w:rPr>
-                <w:rFonts w:ascii="Calibri" w:hAnsi="Calibri" w:eastAsia="ＭＳ 明朝" w:cs="Calibri" w:eastAsiaTheme="minorEastAsia" w:csTheme="minorBidi"/>
-                <w:b/>
-                <w:bCs/>
-                <w:sz w:val="22"/>
-                <w:szCs w:val="22"/>
-              </w:rPr>
               <w:t>Core Requirement</w:t>
             </w:r>
           </w:p>
         </w:tc>
         <w:tc>
-          <w:tcPr>
-            <w:tcW w:w="4148" w:type="dxa"/>
-            <w:tcBorders>
-              <w:top w:val="single" w:sz="4" w:space="0" w:color="auto"/>
-              <w:left w:val="single" w:sz="4" w:space="0" w:color="auto"/>
-              <w:bottom w:val="single" w:sz="4" w:space="0" w:color="auto"/>
-              <w:right w:val="single" w:sz="4" w:space="0" w:color="auto"/>
-            </w:tcBorders>
-            <w:tcMar>
-              <w:top w:w="0" w:type="dxa"/>
-              <w:left w:w="108" w:type="dxa"/>
-              <w:bottom w:w="0" w:type="dxa"/>
-              <w:right w:w="108" w:type="dxa"/>
-            </w:tcMar>
-          </w:tcPr>
           <w:p>
-            <w:pPr>
-              <w:spacing w:after="200" w:line="276" w:lineRule="auto"/>
-            </w:pPr>
             <w:r>
-              <w:rPr>
-                <w:rFonts w:ascii="Calibri" w:hAnsi="Calibri" w:eastAsia="ＭＳ 明朝" w:cs="Calibri" w:eastAsiaTheme="minorEastAsia" w:csTheme="minorBidi"/>
-                <w:b/>
-                <w:bCs/>
-                <w:sz w:val="22"/>
-                <w:szCs w:val="22"/>
-              </w:rPr>
-              <w:t>Location (</w:t>
-            </w:r>
-            <w:r>
-              <w:rPr>
-                <w:rFonts w:ascii="Calibri" w:hAnsi="Calibri" w:eastAsia="ＭＳ 明朝" w:cs="Calibri" w:eastAsiaTheme="minorEastAsia" w:csTheme="minorBidi"/>
-                <w:b/>
-                <w:bCs/>
-                <w:sz w:val="22"/>
-                <w:szCs w:val="22"/>
-              </w:rPr>
-              <w:t>file @</w:t>
-            </w:r>
-            <w:r>
-              <w:rPr>
-                <w:rFonts w:ascii="Calibri" w:hAnsi="Calibri" w:eastAsia="ＭＳ 明朝" w:cs="Calibri" w:eastAsiaTheme="minorEastAsia" w:csTheme="minorBidi"/>
-                <w:b/>
-                <w:bCs/>
-                <w:sz w:val="22"/>
-                <w:szCs w:val="22"/>
-              </w:rPr>
-              <w:t xml:space="preserve"> lines)</w:t>
+              <w:t>Location</w:t>
             </w:r>
           </w:p>
         </w:tc>
         <w:tc>
-          <w:tcPr>
-            <w:tcW w:w="1843" w:type="dxa"/>
-            <w:tcBorders>
-              <w:top w:val="single" w:sz="4" w:space="0" w:color="auto"/>
-              <w:left w:val="single" w:sz="4" w:space="0" w:color="auto"/>
-              <w:bottom w:val="single" w:sz="4" w:space="0" w:color="auto"/>
-              <w:right w:val="single" w:sz="4" w:space="0" w:color="auto"/>
-            </w:tcBorders>
-            <w:tcMar>
-              <w:top w:w="0" w:type="dxa"/>
-              <w:left w:w="108" w:type="dxa"/>
-              <w:bottom w:w="0" w:type="dxa"/>
-              <w:right w:w="108" w:type="dxa"/>
-            </w:tcMar>
-          </w:tcPr>
           <w:p>
-            <w:pPr>
-              <w:rPr>
-                <w:b/>
-              </w:rPr>
-            </w:pPr>
             <w:r>
-              <w:rPr>
-                <w:rFonts w:ascii="Calibri" w:hAnsi="Calibri" w:eastAsia="ＭＳ 明朝" w:cs="Calibri" w:eastAsiaTheme="minorEastAsia" w:csTheme="minorBidi"/>
-                <w:b/>
-                <w:bCs/>
-                <w:sz w:val="22"/>
-                <w:szCs w:val="22"/>
-              </w:rPr>
               <w:t>Status</w:t>
             </w:r>
           </w:p>
@@ -631,913 +320,234 @@
       </w:tr>
       <w:tr>
         <w:tc>
-          <w:tcPr>
-            <w:tcW w:w="534" w:type="dxa"/>
-            <w:tcBorders>
-              <w:top w:val="single" w:sz="4" w:space="0" w:color="auto"/>
-              <w:left w:val="single" w:sz="4" w:space="0" w:color="auto"/>
-              <w:bottom w:val="single" w:sz="4" w:space="0" w:color="auto"/>
-              <w:right w:val="single" w:sz="4" w:space="0" w:color="auto"/>
-            </w:tcBorders>
-            <w:tcMar>
-              <w:top w:w="0" w:type="dxa"/>
-              <w:left w:w="108" w:type="dxa"/>
-              <w:bottom w:w="0" w:type="dxa"/>
-              <w:right w:w="108" w:type="dxa"/>
-            </w:tcMar>
-          </w:tcPr>
           <w:p>
-            <w:pPr>
-              <w:spacing w:after="200" w:line="276" w:lineRule="auto"/>
-            </w:pPr>
             <w:r>
-              <w:rPr>
-                <w:rFonts w:ascii="Calibri" w:hAnsi="Calibri" w:eastAsia="ＭＳ 明朝" w:cs="Calibri" w:eastAsiaTheme="minorEastAsia" w:csTheme="minorBidi"/>
-                <w:sz w:val="22"/>
-                <w:szCs w:val="22"/>
-              </w:rPr>
               <w:t>1</w:t>
             </w:r>
           </w:p>
         </w:tc>
         <w:tc>
-          <w:tcPr>
-            <w:tcW w:w="2230" w:type="dxa"/>
-            <w:tcBorders>
-              <w:top w:val="single" w:sz="4" w:space="0" w:color="auto"/>
-              <w:left w:val="single" w:sz="4" w:space="0" w:color="auto"/>
-              <w:bottom w:val="single" w:sz="4" w:space="0" w:color="auto"/>
-              <w:right w:val="single" w:sz="4" w:space="0" w:color="auto"/>
-            </w:tcBorders>
-            <w:tcMar>
-              <w:top w:w="0" w:type="dxa"/>
-              <w:left w:w="108" w:type="dxa"/>
-              <w:bottom w:w="0" w:type="dxa"/>
-              <w:right w:w="108" w:type="dxa"/>
-            </w:tcMar>
-          </w:tcPr>
           <w:p>
-            <w:pPr>
-              <w:spacing w:after="200" w:line="276" w:lineRule="auto"/>
-            </w:pPr>
             <w:r>
-              <w:rPr>
-                <w:rFonts w:ascii="Calibri" w:hAnsi="Calibri" w:eastAsia="ＭＳ 明朝" w:cs="Calibri" w:eastAsiaTheme="minorEastAsia" w:csTheme="minorBidi"/>
-                <w:sz w:val="22"/>
-                <w:szCs w:val="22"/>
-              </w:rPr>
               <w:t>Authentication + username on every page</w:t>
             </w:r>
           </w:p>
         </w:tc>
         <w:tc>
-          <w:tcPr>
-            <w:tcW w:w="4148" w:type="dxa"/>
-            <w:tcBorders>
-              <w:top w:val="single" w:sz="4" w:space="0" w:color="auto"/>
-              <w:left w:val="single" w:sz="4" w:space="0" w:color="auto"/>
-              <w:bottom w:val="single" w:sz="4" w:space="0" w:color="auto"/>
-              <w:right w:val="single" w:sz="4" w:space="0" w:color="auto"/>
-            </w:tcBorders>
-            <w:tcMar>
-              <w:top w:w="0" w:type="dxa"/>
-              <w:left w:w="108" w:type="dxa"/>
-              <w:bottom w:w="0" w:type="dxa"/>
-              <w:right w:w="108" w:type="dxa"/>
-            </w:tcMar>
-          </w:tcPr>
           <w:p>
-            <w:pPr>
-              <w:spacing w:after="200" w:line="276" w:lineRule="auto"/>
-            </w:pPr>
             <w:r>
-              <w:t>planned</w:t>
+              <w:t>app/Http/Controllers/AuthController.php; routes/web.php; resources/views/layouts/navbar.blade.php</w:t>
             </w:r>
           </w:p>
         </w:tc>
         <w:tc>
-          <w:tcPr>
-            <w:tcW w:w="1843" w:type="dxa"/>
-            <w:tcBorders>
-              <w:top w:val="single" w:sz="4" w:space="0" w:color="auto"/>
-              <w:left w:val="single" w:sz="4" w:space="0" w:color="auto"/>
-              <w:bottom w:val="single" w:sz="4" w:space="0" w:color="auto"/>
-              <w:right w:val="single" w:sz="4" w:space="0" w:color="auto"/>
-            </w:tcBorders>
-            <w:tcMar>
-              <w:top w:w="0" w:type="dxa"/>
-              <w:left w:w="108" w:type="dxa"/>
-              <w:bottom w:w="0" w:type="dxa"/>
-              <w:right w:w="108" w:type="dxa"/>
-            </w:tcMar>
-          </w:tcPr>
           <w:p>
-            <w:pPr>
-              <w:spacing w:after="200" w:line="276" w:lineRule="auto"/>
-            </w:pPr>
             <w:r>
               <w:rPr>
-                <w:rFonts w:ascii="Calibri" w:hAnsi="Calibri" w:eastAsia="ＭＳ 明朝" w:cs="Calibri" w:eastAsiaTheme="minorEastAsia" w:csTheme="minorBidi"/>
-                <w:sz w:val="22"/>
-                <w:szCs w:val="22"/>
+                <w:b/>
+                <w:bCs/>
               </w:rPr>
-              <w:t>Complete/partial/absent</w:t>
+              <w:t>Complete</w:t>
             </w:r>
           </w:p>
         </w:tc>
       </w:tr>
       <w:tr>
         <w:tc>
-          <w:tcPr>
-            <w:tcW w:w="534" w:type="dxa"/>
-            <w:tcBorders>
-              <w:top w:val="single" w:sz="4" w:space="0" w:color="auto"/>
-              <w:left w:val="single" w:sz="4" w:space="0" w:color="auto"/>
-              <w:bottom w:val="single" w:sz="4" w:space="0" w:color="auto"/>
-              <w:right w:val="single" w:sz="4" w:space="0" w:color="auto"/>
-            </w:tcBorders>
-            <w:tcMar>
-              <w:top w:w="0" w:type="dxa"/>
-              <w:left w:w="108" w:type="dxa"/>
-              <w:bottom w:w="0" w:type="dxa"/>
-              <w:right w:w="108" w:type="dxa"/>
-            </w:tcMar>
-          </w:tcPr>
           <w:p>
-            <w:pPr>
-              <w:spacing w:after="200" w:line="276" w:lineRule="auto"/>
-            </w:pPr>
             <w:r>
-              <w:rPr>
-                <w:rFonts w:ascii="Calibri" w:hAnsi="Calibri" w:eastAsia="ＭＳ 明朝" w:cs="Calibri" w:eastAsiaTheme="minorEastAsia" w:csTheme="minorBidi"/>
-                <w:sz w:val="22"/>
-                <w:szCs w:val="22"/>
-              </w:rPr>
               <w:t>2</w:t>
             </w:r>
           </w:p>
         </w:tc>
         <w:tc>
-          <w:tcPr>
-            <w:tcW w:w="2230" w:type="dxa"/>
-            <w:tcBorders>
-              <w:top w:val="single" w:sz="4" w:space="0" w:color="auto"/>
-              <w:left w:val="single" w:sz="4" w:space="0" w:color="auto"/>
-              <w:bottom w:val="single" w:sz="4" w:space="0" w:color="auto"/>
-              <w:right w:val="single" w:sz="4" w:space="0" w:color="auto"/>
-            </w:tcBorders>
-            <w:tcMar>
-              <w:top w:w="0" w:type="dxa"/>
-              <w:left w:w="108" w:type="dxa"/>
-              <w:bottom w:w="0" w:type="dxa"/>
-              <w:right w:w="108" w:type="dxa"/>
-            </w:tcMar>
-          </w:tcPr>
           <w:p>
-            <w:pPr>
-              <w:spacing w:after="200" w:line="276" w:lineRule="auto"/>
-            </w:pPr>
             <w:r>
-              <w:rPr>
-                <w:rFonts w:ascii="Calibri" w:hAnsi="Calibri" w:eastAsia="ＭＳ 明朝" w:cs="Calibri" w:eastAsiaTheme="minorEastAsia" w:csTheme="minorBidi"/>
-                <w:sz w:val="22"/>
-                <w:szCs w:val="22"/>
-              </w:rPr>
               <w:t>3+ related domain tables</w:t>
             </w:r>
           </w:p>
         </w:tc>
         <w:tc>
-          <w:tcPr>
-            <w:tcW w:w="4148" w:type="dxa"/>
-            <w:tcBorders>
-              <w:top w:val="single" w:sz="4" w:space="0" w:color="auto"/>
-              <w:left w:val="single" w:sz="4" w:space="0" w:color="auto"/>
-              <w:bottom w:val="single" w:sz="4" w:space="0" w:color="auto"/>
-              <w:right w:val="single" w:sz="4" w:space="0" w:color="auto"/>
-            </w:tcBorders>
-            <w:tcMar>
-              <w:top w:w="0" w:type="dxa"/>
-              <w:left w:w="108" w:type="dxa"/>
-              <w:bottom w:w="0" w:type="dxa"/>
-              <w:right w:w="108" w:type="dxa"/>
-            </w:tcMar>
-          </w:tcPr>
           <w:p>
-            <w:pPr>
-              <w:spacing w:after="200" w:line="276" w:lineRule="auto"/>
-            </w:pPr>
             <w:r>
-              <w:t>planned</w:t>
+              <w:t>database/migrations/; app/Models/User.php; app/Models/Movie.php; app/Models/Review.php; app/Models/Genre.php</w:t>
             </w:r>
           </w:p>
         </w:tc>
         <w:tc>
-          <w:tcPr>
-            <w:tcW w:w="1843" w:type="dxa"/>
-            <w:tcBorders>
-              <w:top w:val="single" w:sz="4" w:space="0" w:color="auto"/>
-              <w:left w:val="single" w:sz="4" w:space="0" w:color="auto"/>
-              <w:bottom w:val="single" w:sz="4" w:space="0" w:color="auto"/>
-              <w:right w:val="single" w:sz="4" w:space="0" w:color="auto"/>
-            </w:tcBorders>
-            <w:tcMar>
-              <w:top w:w="0" w:type="dxa"/>
-              <w:left w:w="108" w:type="dxa"/>
-              <w:bottom w:w="0" w:type="dxa"/>
-              <w:right w:w="108" w:type="dxa"/>
-            </w:tcMar>
-          </w:tcPr>
           <w:p>
-            <w:pPr>
-              <w:spacing w:after="200" w:line="276" w:lineRule="auto"/>
-            </w:pPr>
             <w:r>
               <w:rPr>
-                <w:rFonts w:ascii="Calibri" w:hAnsi="Calibri" w:eastAsia="ＭＳ 明朝" w:cs="Calibri" w:eastAsiaTheme="minorEastAsia" w:csTheme="minorBidi"/>
-                <w:sz w:val="22"/>
-                <w:szCs w:val="22"/>
+                <w:b/>
+                <w:bCs/>
               </w:rPr>
-              <w:t>Complete/partial/absent</w:t>
-            </w:r>
-          </w:p>
-        </w:tc>
-      </w:tr>
-      <w:tr>
-        <w:trPr>
-          <w:trHeight w:val="840" w:hRule="atLeast"/>
-        </w:trPr>
-        <w:tc>
-          <w:tcPr>
-            <w:tcW w:w="534" w:type="dxa"/>
-            <w:tcBorders>
-              <w:top w:val="single" w:sz="4" w:space="0" w:color="auto"/>
-              <w:left w:val="single" w:sz="4" w:space="0" w:color="auto"/>
-              <w:bottom w:val="single" w:sz="4" w:space="0" w:color="auto"/>
-              <w:right w:val="single" w:sz="4" w:space="0" w:color="auto"/>
-            </w:tcBorders>
-            <w:tcMar>
-              <w:top w:w="0" w:type="dxa"/>
-              <w:left w:w="108" w:type="dxa"/>
-              <w:bottom w:w="0" w:type="dxa"/>
-              <w:right w:w="108" w:type="dxa"/>
-            </w:tcMar>
-          </w:tcPr>
-          <w:p>
-            <w:pPr>
-              <w:spacing w:after="200" w:line="276" w:lineRule="auto"/>
-            </w:pPr>
-            <w:r>
-              <w:rPr>
-                <w:rFonts w:ascii="Calibri" w:hAnsi="Calibri" w:eastAsia="ＭＳ 明朝" w:cs="Calibri" w:eastAsiaTheme="minorEastAsia" w:csTheme="minorBidi"/>
-                <w:sz w:val="22"/>
-                <w:szCs w:val="22"/>
-              </w:rPr>
-              <w:t>3</w:t>
-            </w:r>
-          </w:p>
-        </w:tc>
-        <w:tc>
-          <w:tcPr>
-            <w:tcW w:w="2230" w:type="dxa"/>
-            <w:tcBorders>
-              <w:top w:val="single" w:sz="4" w:space="0" w:color="auto"/>
-              <w:left w:val="single" w:sz="4" w:space="0" w:color="auto"/>
-              <w:bottom w:val="single" w:sz="4" w:space="0" w:color="auto"/>
-              <w:right w:val="single" w:sz="4" w:space="0" w:color="auto"/>
-            </w:tcBorders>
-            <w:tcMar>
-              <w:top w:w="0" w:type="dxa"/>
-              <w:left w:w="108" w:type="dxa"/>
-              <w:bottom w:w="0" w:type="dxa"/>
-              <w:right w:w="108" w:type="dxa"/>
-            </w:tcMar>
-          </w:tcPr>
-          <w:p>
-            <w:pPr>
-              <w:spacing w:after="200" w:line="276" w:lineRule="auto"/>
-            </w:pPr>
-            <w:r>
-              <w:rPr>
-                <w:rFonts w:ascii="Calibri" w:hAnsi="Calibri" w:eastAsia="ＭＳ 明朝" w:cs="Calibri" w:eastAsiaTheme="minorEastAsia" w:csTheme="minorBidi"/>
-                <w:sz w:val="22"/>
-                <w:szCs w:val="22"/>
-              </w:rPr>
-              <w:t>Full CRUD on a main resource</w:t>
-            </w:r>
-          </w:p>
-        </w:tc>
-        <w:tc>
-          <w:tcPr>
-            <w:tcW w:w="4148" w:type="dxa"/>
-            <w:tcBorders>
-              <w:top w:val="single" w:sz="4" w:space="0" w:color="auto"/>
-              <w:left w:val="single" w:sz="4" w:space="0" w:color="auto"/>
-              <w:bottom w:val="single" w:sz="4" w:space="0" w:color="auto"/>
-              <w:right w:val="single" w:sz="4" w:space="0" w:color="auto"/>
-            </w:tcBorders>
-            <w:tcMar>
-              <w:top w:w="0" w:type="dxa"/>
-              <w:left w:w="108" w:type="dxa"/>
-              <w:bottom w:w="0" w:type="dxa"/>
-              <w:right w:w="108" w:type="dxa"/>
-            </w:tcMar>
-          </w:tcPr>
-          <w:p>
-            <w:pPr>
-              <w:spacing w:after="200" w:line="276" w:lineRule="auto"/>
-            </w:pPr>
-            <w:r>
-              <w:t>planned</w:t>
-            </w:r>
-          </w:p>
-        </w:tc>
-        <w:tc>
-          <w:tcPr>
-            <w:tcW w:w="1843" w:type="dxa"/>
-            <w:tcBorders>
-              <w:top w:val="single" w:sz="4" w:space="0" w:color="auto"/>
-              <w:left w:val="single" w:sz="4" w:space="0" w:color="auto"/>
-              <w:bottom w:val="single" w:sz="4" w:space="0" w:color="auto"/>
-              <w:right w:val="single" w:sz="4" w:space="0" w:color="auto"/>
-            </w:tcBorders>
-            <w:tcMar>
-              <w:top w:w="0" w:type="dxa"/>
-              <w:left w:w="108" w:type="dxa"/>
-              <w:bottom w:w="0" w:type="dxa"/>
-              <w:right w:w="108" w:type="dxa"/>
-            </w:tcMar>
-          </w:tcPr>
-          <w:p>
-            <w:pPr>
-              <w:spacing w:after="200" w:line="276" w:lineRule="auto"/>
-            </w:pPr>
-            <w:r>
-              <w:rPr>
-                <w:rFonts w:ascii="Calibri" w:hAnsi="Calibri" w:eastAsia="ＭＳ 明朝" w:cs="Calibri" w:eastAsiaTheme="minorEastAsia" w:csTheme="minorBidi"/>
-                <w:sz w:val="22"/>
-                <w:szCs w:val="22"/>
-              </w:rPr>
-              <w:t>Complete/partial/absent</w:t>
+              <w:t>Complete</w:t>
             </w:r>
           </w:p>
         </w:tc>
       </w:tr>
       <w:tr>
         <w:tc>
-          <w:tcPr>
-            <w:tcW w:w="534" w:type="dxa"/>
-            <w:tcBorders>
-              <w:top w:val="single" w:sz="4" w:space="0" w:color="auto"/>
-              <w:left w:val="single" w:sz="4" w:space="0" w:color="auto"/>
-              <w:bottom w:val="single" w:sz="4" w:space="0" w:color="auto"/>
-              <w:right w:val="single" w:sz="4" w:space="0" w:color="auto"/>
-            </w:tcBorders>
-            <w:tcMar>
-              <w:top w:w="0" w:type="dxa"/>
-              <w:left w:w="108" w:type="dxa"/>
-              <w:bottom w:w="0" w:type="dxa"/>
-              <w:right w:w="108" w:type="dxa"/>
-            </w:tcMar>
-          </w:tcPr>
           <w:p>
-            <w:pPr>
-              <w:spacing w:after="200" w:line="276" w:lineRule="auto"/>
-            </w:pPr>
             <w:r>
-              <w:rPr>
-                <w:rFonts w:ascii="Calibri" w:hAnsi="Calibri" w:eastAsia="ＭＳ 明朝" w:cs="Calibri" w:eastAsiaTheme="minorEastAsia" w:csTheme="minorBidi"/>
-                <w:sz w:val="22"/>
-                <w:szCs w:val="22"/>
-              </w:rPr>
-              <w:t>4</w:t>
+              <w:t>3</w:t>
             </w:r>
           </w:p>
         </w:tc>
         <w:tc>
-          <w:tcPr>
-            <w:tcW w:w="2230" w:type="dxa"/>
-            <w:tcBorders>
-              <w:top w:val="single" w:sz="4" w:space="0" w:color="auto"/>
-              <w:left w:val="single" w:sz="4" w:space="0" w:color="auto"/>
-              <w:bottom w:val="single" w:sz="4" w:space="0" w:color="auto"/>
-              <w:right w:val="single" w:sz="4" w:space="0" w:color="auto"/>
-            </w:tcBorders>
-            <w:tcMar>
-              <w:top w:w="0" w:type="dxa"/>
-              <w:left w:w="108" w:type="dxa"/>
-              <w:bottom w:w="0" w:type="dxa"/>
-              <w:right w:w="108" w:type="dxa"/>
-            </w:tcMar>
-          </w:tcPr>
           <w:p>
-            <w:pPr>
-              <w:spacing w:after="200" w:line="276" w:lineRule="auto"/>
-            </w:pPr>
             <w:r>
-              <w:rPr>
-                <w:rFonts w:ascii="Calibri" w:hAnsi="Calibri" w:eastAsia="ＭＳ 明朝" w:cs="Calibri" w:eastAsiaTheme="minorEastAsia" w:csTheme="minorBidi"/>
-                <w:sz w:val="22"/>
-                <w:szCs w:val="22"/>
-              </w:rPr>
-              <w:t>Server-side validation</w:t>
+              <w:t>Full CRUD on a main resource</w:t>
             </w:r>
           </w:p>
         </w:tc>
         <w:tc>
-          <w:tcPr>
-            <w:tcW w:w="4148" w:type="dxa"/>
-            <w:tcBorders>
-              <w:top w:val="single" w:sz="4" w:space="0" w:color="auto"/>
-              <w:left w:val="single" w:sz="4" w:space="0" w:color="auto"/>
-              <w:bottom w:val="single" w:sz="4" w:space="0" w:color="auto"/>
-              <w:right w:val="single" w:sz="4" w:space="0" w:color="auto"/>
-            </w:tcBorders>
-            <w:tcMar>
-              <w:top w:w="0" w:type="dxa"/>
-              <w:left w:w="108" w:type="dxa"/>
-              <w:bottom w:w="0" w:type="dxa"/>
-              <w:right w:w="108" w:type="dxa"/>
-            </w:tcMar>
-          </w:tcPr>
           <w:p>
-            <w:pPr>
-              <w:spacing w:after="200" w:line="276" w:lineRule="auto"/>
-            </w:pPr>
             <w:r>
-              <w:t>planned</w:t>
+              <w:t>app/Http/Controllers/MovieController.php; routes/web.php; resources/views/admin/movies/</w:t>
             </w:r>
           </w:p>
         </w:tc>
         <w:tc>
-          <w:tcPr>
-            <w:tcW w:w="1843" w:type="dxa"/>
-            <w:tcBorders>
-              <w:top w:val="single" w:sz="4" w:space="0" w:color="auto"/>
-              <w:left w:val="single" w:sz="4" w:space="0" w:color="auto"/>
-              <w:bottom w:val="single" w:sz="4" w:space="0" w:color="auto"/>
-              <w:right w:val="single" w:sz="4" w:space="0" w:color="auto"/>
-            </w:tcBorders>
-            <w:tcMar>
-              <w:top w:w="0" w:type="dxa"/>
-              <w:left w:w="108" w:type="dxa"/>
-              <w:bottom w:w="0" w:type="dxa"/>
-              <w:right w:w="108" w:type="dxa"/>
-            </w:tcMar>
-          </w:tcPr>
           <w:p>
-            <w:pPr>
-              <w:spacing w:after="200" w:line="276" w:lineRule="auto"/>
-            </w:pPr>
             <w:r>
               <w:rPr>
-                <w:rFonts w:ascii="Calibri" w:hAnsi="Calibri" w:eastAsia="ＭＳ 明朝" w:cs="Calibri" w:eastAsiaTheme="minorEastAsia" w:csTheme="minorBidi"/>
-                <w:sz w:val="22"/>
-                <w:szCs w:val="22"/>
+                <w:b/>
+                <w:bCs/>
               </w:rPr>
-              <w:t>Complete/partial/absent</w:t>
+              <w:t>Complete</w:t>
             </w:r>
           </w:p>
         </w:tc>
       </w:tr>
       <w:tr>
         <w:tc>
-          <w:tcPr>
-            <w:tcW w:w="534" w:type="dxa"/>
-            <w:tcBorders>
-              <w:top w:val="single" w:sz="4" w:space="0" w:color="auto"/>
-              <w:left w:val="single" w:sz="4" w:space="0" w:color="auto"/>
-              <w:bottom w:val="single" w:sz="4" w:space="0" w:color="auto"/>
-              <w:right w:val="single" w:sz="4" w:space="0" w:color="auto"/>
-            </w:tcBorders>
-            <w:tcMar>
-              <w:top w:w="0" w:type="dxa"/>
-              <w:left w:w="108" w:type="dxa"/>
-              <w:bottom w:w="0" w:type="dxa"/>
-              <w:right w:w="108" w:type="dxa"/>
-            </w:tcMar>
-          </w:tcPr>
           <w:p>
-            <w:pPr>
-              <w:spacing w:after="200" w:line="276" w:lineRule="auto"/>
-            </w:pPr>
             <w:r>
-              <w:rPr>
-                <w:rFonts w:ascii="Calibri" w:hAnsi="Calibri" w:eastAsia="ＭＳ 明朝" w:cs="Calibri" w:eastAsiaTheme="minorEastAsia" w:csTheme="minorBidi"/>
-                <w:sz w:val="22"/>
-                <w:szCs w:val="22"/>
-              </w:rPr>
-              <w:t>5</w:t>
+              <w:t>4</w:t>
             </w:r>
           </w:p>
         </w:tc>
         <w:tc>
-          <w:tcPr>
-            <w:tcW w:w="2230" w:type="dxa"/>
-            <w:tcBorders>
-              <w:top w:val="single" w:sz="4" w:space="0" w:color="auto"/>
-              <w:left w:val="single" w:sz="4" w:space="0" w:color="auto"/>
-              <w:bottom w:val="single" w:sz="4" w:space="0" w:color="auto"/>
-              <w:right w:val="single" w:sz="4" w:space="0" w:color="auto"/>
-            </w:tcBorders>
-            <w:tcMar>
-              <w:top w:w="0" w:type="dxa"/>
-              <w:left w:w="108" w:type="dxa"/>
-              <w:bottom w:w="0" w:type="dxa"/>
-              <w:right w:w="108" w:type="dxa"/>
-            </w:tcMar>
-          </w:tcPr>
           <w:p>
-            <w:pPr>
-              <w:spacing w:after="200" w:line="276" w:lineRule="auto"/>
-            </w:pPr>
             <w:r>
-              <w:rPr>
-                <w:rFonts w:ascii="Calibri" w:hAnsi="Calibri" w:eastAsia="ＭＳ 明朝" w:cs="Calibri" w:eastAsiaTheme="minorEastAsia" w:csTheme="minorBidi"/>
-                <w:sz w:val="22"/>
-                <w:szCs w:val="22"/>
-              </w:rPr>
-              <w:t>Ownership authorization</w:t>
+              <w:t>Server-side validation</w:t>
             </w:r>
           </w:p>
         </w:tc>
         <w:tc>
-          <w:tcPr>
-            <w:tcW w:w="4148" w:type="dxa"/>
-            <w:tcBorders>
-              <w:top w:val="single" w:sz="4" w:space="0" w:color="auto"/>
-              <w:left w:val="single" w:sz="4" w:space="0" w:color="auto"/>
-              <w:bottom w:val="single" w:sz="4" w:space="0" w:color="auto"/>
-              <w:right w:val="single" w:sz="4" w:space="0" w:color="auto"/>
-            </w:tcBorders>
-            <w:tcMar>
-              <w:top w:w="0" w:type="dxa"/>
-              <w:left w:w="108" w:type="dxa"/>
-              <w:bottom w:w="0" w:type="dxa"/>
-              <w:right w:w="108" w:type="dxa"/>
-            </w:tcMar>
-          </w:tcPr>
           <w:p>
-            <w:pPr>
-              <w:spacing w:after="200" w:line="276" w:lineRule="auto"/>
-            </w:pPr>
             <w:r>
-              <w:t>planned</w:t>
+              <w:t>app/Http/Controllers/AuthController.php; app/Http/Controllers/MovieController.php; app/Http/Controllers/ReviewController.php</w:t>
             </w:r>
           </w:p>
         </w:tc>
         <w:tc>
-          <w:tcPr>
-            <w:tcW w:w="1843" w:type="dxa"/>
-            <w:tcBorders>
-              <w:top w:val="single" w:sz="4" w:space="0" w:color="auto"/>
-              <w:left w:val="single" w:sz="4" w:space="0" w:color="auto"/>
-              <w:bottom w:val="single" w:sz="4" w:space="0" w:color="auto"/>
-              <w:right w:val="single" w:sz="4" w:space="0" w:color="auto"/>
-            </w:tcBorders>
-            <w:tcMar>
-              <w:top w:w="0" w:type="dxa"/>
-              <w:left w:w="108" w:type="dxa"/>
-              <w:bottom w:w="0" w:type="dxa"/>
-              <w:right w:w="108" w:type="dxa"/>
-            </w:tcMar>
-          </w:tcPr>
           <w:p>
-            <w:pPr>
-              <w:spacing w:after="200" w:line="276" w:lineRule="auto"/>
-            </w:pPr>
             <w:r>
               <w:rPr>
-                <w:rFonts w:ascii="Calibri" w:hAnsi="Calibri" w:eastAsia="ＭＳ 明朝" w:cs="Calibri" w:eastAsiaTheme="minorEastAsia" w:csTheme="minorBidi"/>
-                <w:sz w:val="22"/>
-                <w:szCs w:val="22"/>
+                <w:b/>
+                <w:bCs/>
               </w:rPr>
-              <w:t>Complete/partial/absent</w:t>
+              <w:t>Complete</w:t>
             </w:r>
           </w:p>
         </w:tc>
       </w:tr>
       <w:tr>
         <w:tc>
-          <w:tcPr>
-            <w:tcW w:w="6912" w:type="dxa"/>
-            <w:gridSpan w:val="3"/>
-            <w:tcBorders>
-              <w:top w:val="single" w:sz="4" w:space="0" w:color="auto"/>
-              <w:left w:val="single" w:sz="4" w:space="0" w:color="auto"/>
-              <w:bottom w:val="single" w:sz="4" w:space="0" w:color="auto"/>
-              <w:right w:val="single" w:sz="4" w:space="0" w:color="auto"/>
-            </w:tcBorders>
-            <w:tcMar>
-              <w:top w:w="0" w:type="dxa"/>
-              <w:left w:w="108" w:type="dxa"/>
-              <w:bottom w:w="0" w:type="dxa"/>
-              <w:right w:w="108" w:type="dxa"/>
-            </w:tcMar>
-          </w:tcPr>
           <w:p>
-            <w:pPr>
-              <w:spacing w:after="200" w:line="276" w:lineRule="auto"/>
-            </w:pPr>
             <w:r>
-              <w:rPr>
-                <w:rFonts w:ascii="Calibri" w:hAnsi="Calibri" w:eastAsia="ＭＳ 明朝" w:cs="Calibri" w:eastAsiaTheme="minorEastAsia" w:csTheme="minorBidi"/>
-                <w:sz w:val="22"/>
-                <w:szCs w:val="22"/>
-              </w:rPr>
-              <w:t>Total Score</w:t>
-            </w:r>
-            <w:r>
-              <w:rPr>
-                <w:rFonts w:ascii="Calibri" w:hAnsi="Calibri" w:eastAsia="ＭＳ 明朝" w:cs="Calibri" w:eastAsiaTheme="minorEastAsia" w:csTheme="minorBidi"/>
-                <w:sz w:val="22"/>
-                <w:szCs w:val="22"/>
-              </w:rPr>
-              <w:t xml:space="preserve"> | </w:t>
-            </w:r>
-            <w:r>
-              <w:rPr>
-                <w:rFonts w:ascii="Calibri" w:hAnsi="Calibri" w:eastAsia="ＭＳ 明朝" w:cs="Calibri" w:eastAsiaTheme="minorEastAsia" w:csTheme="minorBidi"/>
-                <w:sz w:val="22"/>
-                <w:szCs w:val="22"/>
-              </w:rPr>
-              <w:t>Complete = 0.12</w:t>
-            </w:r>
-            <w:r>
-              <w:rPr>
-                <w:rFonts w:ascii="Calibri" w:hAnsi="Calibri" w:eastAsia="ＭＳ 明朝" w:cs="Calibri" w:eastAsiaTheme="minorEastAsia" w:csTheme="minorBidi"/>
-                <w:sz w:val="22"/>
-                <w:szCs w:val="22"/>
-              </w:rPr>
-              <w:t xml:space="preserve"> | </w:t>
-            </w:r>
-            <w:r>
-              <w:rPr>
-                <w:rFonts w:ascii="Calibri" w:hAnsi="Calibri" w:eastAsia="ＭＳ 明朝" w:cs="Calibri" w:eastAsiaTheme="minorEastAsia" w:csTheme="minorBidi"/>
-                <w:sz w:val="22"/>
-                <w:szCs w:val="22"/>
-              </w:rPr>
-              <w:t>Partial = 0.06</w:t>
-            </w:r>
-            <w:r>
-              <w:rPr>
-                <w:rFonts w:ascii="Calibri" w:hAnsi="Calibri" w:eastAsia="ＭＳ 明朝" w:cs="Calibri" w:eastAsiaTheme="minorEastAsia" w:csTheme="minorBidi"/>
-                <w:sz w:val="22"/>
-                <w:szCs w:val="22"/>
-              </w:rPr>
-              <w:t xml:space="preserve"> | </w:t>
-            </w:r>
-            <w:r>
-              <w:rPr>
-                <w:rFonts w:ascii="Calibri" w:hAnsi="Calibri" w:eastAsia="ＭＳ 明朝" w:cs="Calibri" w:eastAsiaTheme="minorEastAsia" w:csTheme="minorBidi"/>
-                <w:sz w:val="22"/>
-                <w:szCs w:val="22"/>
-              </w:rPr>
-              <w:t>Absent = 0</w:t>
+              <w:t>5</w:t>
             </w:r>
           </w:p>
         </w:tc>
         <w:tc>
-          <w:tcPr>
-            <w:tcW w:w="1843" w:type="dxa"/>
-            <w:tcBorders>
-              <w:top w:val="single" w:sz="4" w:space="0" w:color="auto"/>
-              <w:left w:val="single" w:sz="4" w:space="0" w:color="auto"/>
-              <w:bottom w:val="single" w:sz="4" w:space="0" w:color="auto"/>
-              <w:right w:val="single" w:sz="4" w:space="0" w:color="auto"/>
-            </w:tcBorders>
-            <w:tcMar>
-              <w:top w:w="0" w:type="dxa"/>
-              <w:left w:w="108" w:type="dxa"/>
-              <w:bottom w:w="0" w:type="dxa"/>
-              <w:right w:w="108" w:type="dxa"/>
-            </w:tcMar>
-          </w:tcPr>
           <w:p>
-            <w:pPr>
-              <w:spacing w:after="200" w:line="276" w:lineRule="auto"/>
-            </w:pPr>
+            <w:r>
+              <w:t>Ownership authorization</w:t>
+            </w:r>
+          </w:p>
+        </w:tc>
+        <w:tc>
+          <w:p>
+            <w:r>
+              <w:t>app/Http/Controllers/ReviewController.php; app/Models/Review.php; resources/views/my-reviews.blade.php</w:t>
+            </w:r>
+          </w:p>
+        </w:tc>
+        <w:tc>
+          <w:p>
+            <w:r>
+              <w:rPr>
+                <w:b/>
+                <w:bCs/>
+              </w:rPr>
+              <w:t>Complete</w:t>
+            </w:r>
           </w:p>
         </w:tc>
       </w:tr>
     </w:tbl>
     <w:p>
+      <w:r>
+        <w:rPr>
+          <w:b/>
+          <w:bCs/>
+        </w:rPr>
+        <w:t>Core score: 0.60</w:t>
+      </w:r>
+    </w:p>
+    <w:p>
       <w:pPr>
-        <w:spacing w:after="200" w:line="276" w:lineRule="auto"/>
+        <w:pStyle w:val="Heading3"/>
+        <w:outlineLvl w:val="2"/>
       </w:pPr>
+      <w:r>
+        <w:t>Features</w:t>
+      </w:r>
     </w:p>
     <w:tbl>
-      <w:tblPr>
-        <w:tblStyle w:val="TableGrid"/>
-        <w:tblW w:w="0" w:type="auto"/>
-        <w:tblBorders>
-          <w:top w:val="single" w:sz="4" w:space="0" w:color="auto"/>
-          <w:left w:val="single" w:sz="4" w:space="0" w:color="auto"/>
-          <w:bottom w:val="single" w:sz="4" w:space="0" w:color="auto"/>
-          <w:right w:val="single" w:sz="4" w:space="0" w:color="auto"/>
-          <w:insideH w:val="single" w:sz="4" w:space="0" w:color="auto"/>
-          <w:insideV w:val="single" w:sz="4" w:space="0" w:color="auto"/>
-        </w:tblBorders>
-        <w:tblCellMar>
-          <w:top w:w="0" w:type="dxa"/>
-          <w:left w:w="108" w:type="dxa"/>
-          <w:bottom w:w="0" w:type="dxa"/>
-          <w:right w:w="108" w:type="dxa"/>
-        </w:tblCellMar>
-        <w:tblLook w:firstRow="1" w:firstColumn="1" w:noVBand="1"/>
-      </w:tblPr>
+      <w:tblPr/>
       <w:tblGrid>
-        <w:gridCol w:w="443"/>
-        <w:gridCol w:w="1656"/>
-        <w:gridCol w:w="4654"/>
-        <w:gridCol w:w="1169"/>
-        <w:gridCol w:w="934"/>
+        <w:gridCol w:w="1872"/>
+        <w:gridCol w:w="1872"/>
+        <w:gridCol w:w="1872"/>
+        <w:gridCol w:w="1872"/>
+        <w:gridCol w:w="1872"/>
       </w:tblGrid>
       <w:tr>
         <w:tc>
-          <w:tcPr>
-            <w:tcW w:w="444" w:type="dxa"/>
-            <w:tcBorders>
-              <w:top w:val="single" w:sz="4" w:space="0" w:color="auto"/>
-              <w:left w:val="single" w:sz="4" w:space="0" w:color="auto"/>
-              <w:bottom w:val="single" w:sz="4" w:space="0" w:color="auto"/>
-              <w:right w:val="single" w:sz="4" w:space="0" w:color="auto"/>
-            </w:tcBorders>
-            <w:tcMar>
-              <w:top w:w="0" w:type="dxa"/>
-              <w:left w:w="108" w:type="dxa"/>
-              <w:bottom w:w="0" w:type="dxa"/>
-              <w:right w:w="108" w:type="dxa"/>
-            </w:tcMar>
-          </w:tcPr>
           <w:p>
-            <w:pPr>
-              <w:spacing w:after="200" w:line="276" w:lineRule="auto"/>
-            </w:pPr>
             <w:r>
-              <w:rPr>
-                <w:rFonts w:ascii="Calibri" w:hAnsi="Calibri" w:eastAsia="ＭＳ 明朝" w:cs="Calibri" w:eastAsiaTheme="minorEastAsia" w:csTheme="minorBidi"/>
-                <w:b/>
-                <w:bCs/>
-                <w:sz w:val="22"/>
-                <w:szCs w:val="22"/>
-              </w:rPr>
               <w:t>#</w:t>
             </w:r>
           </w:p>
         </w:tc>
         <w:tc>
-          <w:tcPr>
-            <w:tcW w:w="1659" w:type="dxa"/>
-            <w:tcBorders>
-              <w:top w:val="single" w:sz="4" w:space="0" w:color="auto"/>
-              <w:left w:val="single" w:sz="4" w:space="0" w:color="auto"/>
-              <w:bottom w:val="single" w:sz="4" w:space="0" w:color="auto"/>
-              <w:right w:val="single" w:sz="4" w:space="0" w:color="auto"/>
-            </w:tcBorders>
-            <w:tcMar>
-              <w:top w:w="0" w:type="dxa"/>
-              <w:left w:w="108" w:type="dxa"/>
-              <w:bottom w:w="0" w:type="dxa"/>
-              <w:right w:w="108" w:type="dxa"/>
-            </w:tcMar>
-          </w:tcPr>
           <w:p>
-            <w:pPr>
-              <w:spacing w:after="200" w:line="276" w:lineRule="auto"/>
-            </w:pPr>
             <w:r>
-              <w:rPr>
-                <w:rFonts w:ascii="Calibri" w:hAnsi="Calibri" w:eastAsia="ＭＳ 明朝" w:cs="Calibri" w:eastAsiaTheme="minorEastAsia" w:csTheme="minorBidi"/>
-                <w:b/>
-                <w:bCs/>
-                <w:sz w:val="22"/>
-                <w:szCs w:val="22"/>
-              </w:rPr>
               <w:t>Feature</w:t>
             </w:r>
           </w:p>
         </w:tc>
         <w:tc>
-          <w:tcPr>
-            <w:tcW w:w="4951" w:type="dxa"/>
-            <w:tcBorders>
-              <w:top w:val="single" w:sz="4" w:space="0" w:color="auto"/>
-              <w:left w:val="single" w:sz="4" w:space="0" w:color="auto"/>
-              <w:bottom w:val="single" w:sz="4" w:space="0" w:color="auto"/>
-              <w:right w:val="single" w:sz="4" w:space="0" w:color="auto"/>
-            </w:tcBorders>
-            <w:tcMar>
-              <w:top w:w="0" w:type="dxa"/>
-              <w:left w:w="108" w:type="dxa"/>
-              <w:bottom w:w="0" w:type="dxa"/>
-              <w:right w:w="108" w:type="dxa"/>
-            </w:tcMar>
-          </w:tcPr>
           <w:p>
-            <w:pPr>
-              <w:rPr>
-                <w:b/>
-                <w:bCs/>
-              </w:rPr>
-            </w:pPr>
             <w:r>
-              <w:rPr>
-                <w:rFonts w:ascii="Calibri" w:hAnsi="Calibri" w:eastAsia="ＭＳ 明朝" w:cs="Calibri" w:eastAsiaTheme="minorEastAsia" w:csTheme="minorBidi"/>
-                <w:b/>
-                <w:bCs/>
-                <w:sz w:val="22"/>
-                <w:szCs w:val="22"/>
-              </w:rPr>
-              <w:t>Location (</w:t>
-            </w:r>
-            <w:r>
-              <w:rPr>
-                <w:rFonts w:ascii="Calibri" w:hAnsi="Calibri" w:eastAsia="ＭＳ 明朝" w:cs="Calibri" w:eastAsiaTheme="minorEastAsia" w:csTheme="minorBidi"/>
-                <w:b/>
-                <w:bCs/>
-                <w:sz w:val="22"/>
-                <w:szCs w:val="22"/>
-              </w:rPr>
-              <w:t>file @</w:t>
-            </w:r>
-            <w:r>
-              <w:rPr>
-                <w:rFonts w:ascii="Calibri" w:hAnsi="Calibri" w:eastAsia="ＭＳ 明朝" w:cs="Calibri" w:eastAsiaTheme="minorEastAsia" w:csTheme="minorBidi"/>
-                <w:b/>
-                <w:bCs/>
-                <w:sz w:val="22"/>
-                <w:szCs w:val="22"/>
-              </w:rPr>
-              <w:t xml:space="preserve"> lines)</w:t>
+              <w:t>Location</w:t>
             </w:r>
           </w:p>
         </w:tc>
         <w:tc>
-          <w:tcPr>
-            <w:tcW w:w="851" w:type="dxa"/>
-            <w:tcBorders>
-              <w:top w:val="single" w:sz="4" w:space="0" w:color="auto"/>
-              <w:left w:val="single" w:sz="4" w:space="0" w:color="auto"/>
-              <w:bottom w:val="single" w:sz="4" w:space="0" w:color="auto"/>
-              <w:right w:val="single" w:sz="4" w:space="0" w:color="auto"/>
-            </w:tcBorders>
-            <w:tcMar>
-              <w:top w:w="0" w:type="dxa"/>
-              <w:left w:w="108" w:type="dxa"/>
-              <w:bottom w:w="0" w:type="dxa"/>
-              <w:right w:w="108" w:type="dxa"/>
-            </w:tcMar>
-          </w:tcPr>
           <w:p>
-            <w:pPr>
-              <w:rPr>
-                <w:b/>
-              </w:rPr>
-            </w:pPr>
             <w:r>
-              <w:rPr>
-                <w:rFonts w:ascii="Calibri" w:hAnsi="Calibri" w:eastAsia="ＭＳ 明朝" w:cs="Calibri" w:eastAsiaTheme="minorEastAsia" w:csTheme="minorBidi"/>
-                <w:b/>
-                <w:bCs/>
-                <w:sz w:val="22"/>
-                <w:szCs w:val="22"/>
-              </w:rPr>
               <w:t>Status</w:t>
             </w:r>
           </w:p>
         </w:tc>
         <w:tc>
-          <w:tcPr>
-            <w:tcW w:w="951" w:type="dxa"/>
-            <w:tcBorders>
-              <w:top w:val="single" w:sz="4" w:space="0" w:color="auto"/>
-              <w:left w:val="single" w:sz="4" w:space="0" w:color="auto"/>
-              <w:bottom w:val="single" w:sz="4" w:space="0" w:color="auto"/>
-              <w:right w:val="single" w:sz="4" w:space="0" w:color="auto"/>
-            </w:tcBorders>
-            <w:tcMar>
-              <w:top w:w="0" w:type="dxa"/>
-              <w:left w:w="108" w:type="dxa"/>
-              <w:bottom w:w="0" w:type="dxa"/>
-              <w:right w:w="108" w:type="dxa"/>
-            </w:tcMar>
-          </w:tcPr>
           <w:p>
-            <w:pPr>
-              <w:rPr>
-                <w:b/>
-                <w:bCs/>
-              </w:rPr>
-            </w:pPr>
             <w:r>
-              <w:rPr>
-                <w:rFonts w:ascii="Calibri" w:hAnsi="Calibri" w:eastAsia="ＭＳ 明朝" w:cs="Calibri" w:eastAsiaTheme="minorEastAsia" w:csTheme="minorBidi"/>
-                <w:b/>
-                <w:bCs/>
-                <w:sz w:val="22"/>
-                <w:szCs w:val="22"/>
-              </w:rPr>
               <w:t>Score</w:t>
             </w:r>
           </w:p>
@@ -1545,156 +555,40 @@
       </w:tr>
       <w:tr>
         <w:tc>
-          <w:tcPr>
-            <w:tcW w:w="444" w:type="dxa"/>
-            <w:tcBorders>
-              <w:top w:val="single" w:sz="4" w:space="0" w:color="auto"/>
-              <w:left w:val="single" w:sz="4" w:space="0" w:color="auto"/>
-              <w:bottom w:val="single" w:sz="4" w:space="0" w:color="auto"/>
-              <w:right w:val="single" w:sz="4" w:space="0" w:color="auto"/>
-            </w:tcBorders>
-            <w:tcMar>
-              <w:top w:w="0" w:type="dxa"/>
-              <w:left w:w="108" w:type="dxa"/>
-              <w:bottom w:w="0" w:type="dxa"/>
-              <w:right w:w="108" w:type="dxa"/>
-            </w:tcMar>
-          </w:tcPr>
           <w:p>
-            <w:pPr>
-              <w:spacing w:after="200" w:line="276" w:lineRule="auto"/>
-            </w:pPr>
             <w:r>
-              <w:rPr>
-                <w:rFonts w:ascii="Calibri" w:hAnsi="Calibri" w:eastAsia="ＭＳ 明朝" w:cs="Calibri" w:eastAsiaTheme="minorEastAsia" w:csTheme="minorBidi"/>
-                <w:sz w:val="22"/>
-                <w:szCs w:val="22"/>
-              </w:rPr>
               <w:t>6</w:t>
             </w:r>
           </w:p>
         </w:tc>
         <w:tc>
-          <w:tcPr>
-            <w:tcW w:w="1659" w:type="dxa"/>
-            <w:tcBorders>
-              <w:top w:val="single" w:sz="4" w:space="0" w:color="auto"/>
-              <w:left w:val="single" w:sz="4" w:space="0" w:color="auto"/>
-              <w:bottom w:val="single" w:sz="4" w:space="0" w:color="auto"/>
-              <w:right w:val="single" w:sz="4" w:space="0" w:color="auto"/>
-            </w:tcBorders>
-            <w:tcMar>
-              <w:top w:w="0" w:type="dxa"/>
-              <w:left w:w="108" w:type="dxa"/>
-              <w:bottom w:w="0" w:type="dxa"/>
-              <w:right w:w="108" w:type="dxa"/>
-            </w:tcMar>
-          </w:tcPr>
           <w:p>
-            <w:pPr>
-              <w:spacing w:after="200" w:line="276" w:lineRule="auto"/>
-            </w:pPr>
             <w:r>
-              <w:rPr>
-                <w:rFonts w:ascii="Calibri" w:hAnsi="Calibri" w:eastAsia="ＭＳ 明朝" w:cs="Calibri" w:eastAsiaTheme="minorEastAsia" w:csTheme="minorBidi"/>
-                <w:sz w:val="22"/>
-                <w:szCs w:val="22"/>
-              </w:rPr>
-              <w:t xml:space="preserve">Image / file upload </w:t>
+              <w:t>Image / file upload</w:t>
             </w:r>
           </w:p>
         </w:tc>
         <w:tc>
-          <w:tcPr>
-            <w:tcW w:w="4951" w:type="dxa"/>
-            <w:tcBorders>
-              <w:top w:val="single" w:sz="4" w:space="0" w:color="auto"/>
-              <w:left w:val="single" w:sz="4" w:space="0" w:color="auto"/>
-              <w:bottom w:val="single" w:sz="4" w:space="0" w:color="auto"/>
-              <w:right w:val="single" w:sz="4" w:space="0" w:color="auto"/>
-            </w:tcBorders>
-            <w:tcMar>
-              <w:top w:w="0" w:type="dxa"/>
-              <w:left w:w="108" w:type="dxa"/>
-              <w:bottom w:w="0" w:type="dxa"/>
-              <w:right w:w="108" w:type="dxa"/>
-            </w:tcMar>
-          </w:tcPr>
           <w:p>
-            <w:pPr>
-              <w:spacing w:after="200" w:line="276" w:lineRule="auto"/>
-            </w:pPr>
-          </w:p>
-        </w:tc>
-        <w:tc>
-          <w:tcPr>
-            <w:tcW w:w="851" w:type="dxa"/>
-            <w:tcBorders>
-              <w:top w:val="single" w:sz="4" w:space="0" w:color="auto"/>
-              <w:left w:val="single" w:sz="4" w:space="0" w:color="auto"/>
-              <w:bottom w:val="single" w:sz="4" w:space="0" w:color="auto"/>
-              <w:right w:val="single" w:sz="4" w:space="0" w:color="auto"/>
-            </w:tcBorders>
-            <w:tcMar>
-              <w:top w:w="0" w:type="dxa"/>
-              <w:left w:w="108" w:type="dxa"/>
-              <w:bottom w:w="0" w:type="dxa"/>
-              <w:right w:w="108" w:type="dxa"/>
-            </w:tcMar>
-          </w:tcPr>
-          <w:p>
-            <w:pPr>
-              <w:spacing w:after="200" w:line="276" w:lineRule="auto"/>
-            </w:pPr>
             <w:r>
-              <w:rPr>
-                <w:rFonts w:ascii="Calibri" w:hAnsi="Calibri" w:eastAsia="ＭＳ 明朝" w:cs="Calibri" w:eastAsiaTheme="minorEastAsia" w:csTheme="minorBidi"/>
-                <w:sz w:val="22"/>
-                <w:szCs w:val="22"/>
-              </w:rPr>
-              <w:t>Complete/</w:t>
-            </w:r>
-          </w:p>
-          <w:p>
-            <w:pPr>
-              <w:spacing w:after="200" w:line="276" w:lineRule="auto"/>
-            </w:pPr>
-            <w:r>
-              <w:rPr>
-                <w:rFonts w:ascii="Calibri" w:hAnsi="Calibri" w:eastAsia="ＭＳ 明朝" w:cs="Calibri" w:eastAsiaTheme="minorEastAsia" w:csTheme="minorBidi"/>
-                <w:sz w:val="22"/>
-                <w:szCs w:val="22"/>
-              </w:rPr>
-              <w:t>Absent</w:t>
+              <w:t>app/Http/Controllers/MovieController.php; resources/views/admin/movies/create.blade.php; resources/views/admin/movies/edit.blade.php; public/images/</w:t>
             </w:r>
           </w:p>
         </w:tc>
         <w:tc>
-          <w:tcPr>
-            <w:tcW w:w="951" w:type="dxa"/>
-            <w:tcBorders>
-              <w:top w:val="single" w:sz="4" w:space="0" w:color="auto"/>
-              <w:left w:val="single" w:sz="4" w:space="0" w:color="auto"/>
-              <w:bottom w:val="single" w:sz="4" w:space="0" w:color="auto"/>
-              <w:right w:val="single" w:sz="4" w:space="0" w:color="auto"/>
-            </w:tcBorders>
-            <w:tcMar>
-              <w:top w:w="0" w:type="dxa"/>
-              <w:left w:w="108" w:type="dxa"/>
-              <w:bottom w:w="0" w:type="dxa"/>
-              <w:right w:w="108" w:type="dxa"/>
-            </w:tcMar>
-          </w:tcPr>
           <w:p>
-            <w:pPr>
-              <w:spacing w:after="200" w:line="276" w:lineRule="auto"/>
-            </w:pPr>
             <w:r>
               <w:rPr>
-                <w:rFonts w:ascii="Calibri" w:hAnsi="Calibri" w:eastAsia="ＭＳ 明朝" w:cs="Calibri" w:eastAsiaTheme="minorEastAsia" w:csTheme="minorBidi"/>
-                <w:sz w:val="22"/>
-                <w:szCs w:val="22"/>
+                <w:b/>
+                <w:bCs/>
               </w:rPr>
+              <w:t>Complete</w:t>
+            </w:r>
+          </w:p>
+        </w:tc>
+        <w:tc>
+          <w:p>
+            <w:r>
               <w:t>+0.05</w:t>
             </w:r>
           </w:p>
@@ -1702,159 +596,40 @@
       </w:tr>
       <w:tr>
         <w:tc>
-          <w:tcPr>
-            <w:tcW w:w="444" w:type="dxa"/>
-            <w:tcBorders>
-              <w:top w:val="single" w:sz="4" w:space="0" w:color="auto"/>
-              <w:left w:val="single" w:sz="4" w:space="0" w:color="auto"/>
-              <w:bottom w:val="single" w:sz="4" w:space="0" w:color="auto"/>
-              <w:right w:val="single" w:sz="4" w:space="0" w:color="auto"/>
-            </w:tcBorders>
-            <w:tcMar>
-              <w:top w:w="0" w:type="dxa"/>
-              <w:left w:w="108" w:type="dxa"/>
-              <w:bottom w:w="0" w:type="dxa"/>
-              <w:right w:w="108" w:type="dxa"/>
-            </w:tcMar>
-          </w:tcPr>
           <w:p>
-            <w:pPr>
-              <w:spacing w:after="200" w:line="276" w:lineRule="auto"/>
-            </w:pPr>
             <w:r>
-              <w:rPr>
-                <w:rFonts w:ascii="Calibri" w:hAnsi="Calibri" w:eastAsia="ＭＳ 明朝" w:cs="Calibri" w:eastAsiaTheme="minorEastAsia" w:csTheme="minorBidi"/>
-                <w:sz w:val="22"/>
-                <w:szCs w:val="22"/>
-              </w:rPr>
               <w:t>7</w:t>
             </w:r>
           </w:p>
         </w:tc>
         <w:tc>
-          <w:tcPr>
-            <w:tcW w:w="1659" w:type="dxa"/>
-            <w:tcBorders>
-              <w:top w:val="single" w:sz="4" w:space="0" w:color="auto"/>
-              <w:left w:val="single" w:sz="4" w:space="0" w:color="auto"/>
-              <w:bottom w:val="single" w:sz="4" w:space="0" w:color="auto"/>
-              <w:right w:val="single" w:sz="4" w:space="0" w:color="auto"/>
-            </w:tcBorders>
-            <w:tcMar>
-              <w:top w:w="0" w:type="dxa"/>
-              <w:left w:w="108" w:type="dxa"/>
-              <w:bottom w:w="0" w:type="dxa"/>
-              <w:right w:w="108" w:type="dxa"/>
-            </w:tcMar>
-          </w:tcPr>
           <w:p>
-            <w:pPr>
-              <w:spacing w:after="200" w:line="276" w:lineRule="auto"/>
-            </w:pPr>
             <w:r>
-              <w:rPr>
-                <w:rFonts w:ascii="Calibri" w:hAnsi="Calibri" w:eastAsia="ＭＳ 明朝" w:cs="Calibri" w:eastAsiaTheme="minorEastAsia" w:csTheme="minorBidi"/>
-                <w:sz w:val="22"/>
-                <w:szCs w:val="22"/>
-              </w:rPr>
-              <w:t>Pagination combined with search / filtering</w:t>
+              <w:t>Pagination combined with search/filtering</w:t>
             </w:r>
           </w:p>
         </w:tc>
         <w:tc>
-          <w:tcPr>
-            <w:tcW w:w="4951" w:type="dxa"/>
-            <w:tcBorders>
-              <w:top w:val="single" w:sz="4" w:space="0" w:color="auto"/>
-              <w:left w:val="single" w:sz="4" w:space="0" w:color="auto"/>
-              <w:bottom w:val="single" w:sz="4" w:space="0" w:color="auto"/>
-              <w:right w:val="single" w:sz="4" w:space="0" w:color="auto"/>
-            </w:tcBorders>
-            <w:tcMar>
-              <w:top w:w="0" w:type="dxa"/>
-              <w:left w:w="108" w:type="dxa"/>
-              <w:bottom w:w="0" w:type="dxa"/>
-              <w:right w:w="108" w:type="dxa"/>
-            </w:tcMar>
-          </w:tcPr>
           <w:p>
-            <w:pPr>
-              <w:spacing w:after="200" w:line="276" w:lineRule="auto"/>
-            </w:pPr>
             <w:r>
-              <w:t>planned</w:t>
+              <w:t>app/Http/Controllers/MovieController.php; resources/views/movies/index.blade.php</w:t>
             </w:r>
           </w:p>
         </w:tc>
         <w:tc>
-          <w:tcPr>
-            <w:tcW w:w="851" w:type="dxa"/>
-            <w:tcBorders>
-              <w:top w:val="single" w:sz="4" w:space="0" w:color="auto"/>
-              <w:left w:val="single" w:sz="4" w:space="0" w:color="auto"/>
-              <w:bottom w:val="single" w:sz="4" w:space="0" w:color="auto"/>
-              <w:right w:val="single" w:sz="4" w:space="0" w:color="auto"/>
-            </w:tcBorders>
-            <w:tcMar>
-              <w:top w:w="0" w:type="dxa"/>
-              <w:left w:w="108" w:type="dxa"/>
-              <w:bottom w:w="0" w:type="dxa"/>
-              <w:right w:w="108" w:type="dxa"/>
-            </w:tcMar>
-          </w:tcPr>
           <w:p>
-            <w:pPr>
-              <w:spacing w:after="200" w:line="276" w:lineRule="auto"/>
-            </w:pPr>
             <w:r>
               <w:rPr>
-                <w:rFonts w:ascii="Calibri" w:hAnsi="Calibri" w:eastAsia="ＭＳ 明朝" w:cs="Calibri" w:eastAsiaTheme="minorEastAsia" w:csTheme="minorBidi"/>
-                <w:sz w:val="22"/>
-                <w:szCs w:val="22"/>
+                <w:b/>
+                <w:bCs/>
               </w:rPr>
-              <w:t>Complete/</w:t>
-            </w:r>
-          </w:p>
-          <w:p>
-            <w:pPr>
-              <w:spacing w:after="200" w:line="276" w:lineRule="auto"/>
-            </w:pPr>
-            <w:r>
-              <w:rPr>
-                <w:rFonts w:ascii="Calibri" w:hAnsi="Calibri" w:eastAsia="ＭＳ 明朝" w:cs="Calibri" w:eastAsiaTheme="minorEastAsia" w:csTheme="minorBidi"/>
-                <w:sz w:val="22"/>
-                <w:szCs w:val="22"/>
-              </w:rPr>
-              <w:t>Absent</w:t>
+              <w:t>Complete</w:t>
             </w:r>
           </w:p>
         </w:tc>
         <w:tc>
-          <w:tcPr>
-            <w:tcW w:w="951" w:type="dxa"/>
-            <w:tcBorders>
-              <w:top w:val="single" w:sz="4" w:space="0" w:color="auto"/>
-              <w:left w:val="single" w:sz="4" w:space="0" w:color="auto"/>
-              <w:bottom w:val="single" w:sz="4" w:space="0" w:color="auto"/>
-              <w:right w:val="single" w:sz="4" w:space="0" w:color="auto"/>
-            </w:tcBorders>
-            <w:tcMar>
-              <w:top w:w="0" w:type="dxa"/>
-              <w:left w:w="108" w:type="dxa"/>
-              <w:bottom w:w="0" w:type="dxa"/>
-              <w:right w:w="108" w:type="dxa"/>
-            </w:tcMar>
-          </w:tcPr>
           <w:p>
-            <w:pPr>
-              <w:spacing w:after="200" w:line="276" w:lineRule="auto"/>
-            </w:pPr>
             <w:r>
-              <w:rPr>
-                <w:rFonts w:ascii="Calibri" w:hAnsi="Calibri" w:eastAsia="ＭＳ 明朝" w:cs="Calibri" w:eastAsiaTheme="minorEastAsia" w:csTheme="minorBidi"/>
-                <w:sz w:val="22"/>
-                <w:szCs w:val="22"/>
-              </w:rPr>
               <w:t>+0.05</w:t>
             </w:r>
           </w:p>
@@ -1862,156 +637,40 @@
       </w:tr>
       <w:tr>
         <w:tc>
-          <w:tcPr>
-            <w:tcW w:w="444" w:type="dxa"/>
-            <w:tcBorders>
-              <w:top w:val="single" w:sz="4" w:space="0" w:color="auto"/>
-              <w:left w:val="single" w:sz="4" w:space="0" w:color="auto"/>
-              <w:bottom w:val="single" w:sz="4" w:space="0" w:color="auto"/>
-              <w:right w:val="single" w:sz="4" w:space="0" w:color="auto"/>
-            </w:tcBorders>
-            <w:tcMar>
-              <w:top w:w="0" w:type="dxa"/>
-              <w:left w:w="108" w:type="dxa"/>
-              <w:bottom w:w="0" w:type="dxa"/>
-              <w:right w:w="108" w:type="dxa"/>
-            </w:tcMar>
-          </w:tcPr>
           <w:p>
-            <w:pPr>
-              <w:spacing w:after="200" w:line="276" w:lineRule="auto"/>
-            </w:pPr>
             <w:r>
-              <w:rPr>
-                <w:rFonts w:ascii="Calibri" w:hAnsi="Calibri" w:eastAsia="ＭＳ 明朝" w:cs="Calibri" w:eastAsiaTheme="minorEastAsia" w:csTheme="minorBidi"/>
-                <w:sz w:val="22"/>
-                <w:szCs w:val="22"/>
-              </w:rPr>
               <w:t>8</w:t>
             </w:r>
           </w:p>
         </w:tc>
         <w:tc>
-          <w:tcPr>
-            <w:tcW w:w="1659" w:type="dxa"/>
-            <w:tcBorders>
-              <w:top w:val="single" w:sz="4" w:space="0" w:color="auto"/>
-              <w:left w:val="single" w:sz="4" w:space="0" w:color="auto"/>
-              <w:bottom w:val="single" w:sz="4" w:space="0" w:color="auto"/>
-              <w:right w:val="single" w:sz="4" w:space="0" w:color="auto"/>
-            </w:tcBorders>
-            <w:tcMar>
-              <w:top w:w="0" w:type="dxa"/>
-              <w:left w:w="108" w:type="dxa"/>
-              <w:bottom w:w="0" w:type="dxa"/>
-              <w:right w:w="108" w:type="dxa"/>
-            </w:tcMar>
-          </w:tcPr>
           <w:p>
-            <w:pPr>
-              <w:spacing w:after="200" w:line="276" w:lineRule="auto"/>
-            </w:pPr>
             <w:r>
-              <w:rPr>
-                <w:rFonts w:ascii="Calibri" w:hAnsi="Calibri" w:eastAsia="ＭＳ 明朝" w:cs="Calibri" w:eastAsiaTheme="minorEastAsia" w:csTheme="minorBidi"/>
-                <w:sz w:val="22"/>
-                <w:szCs w:val="22"/>
-              </w:rPr>
               <w:t>Coherent &amp; usable app</w:t>
             </w:r>
           </w:p>
         </w:tc>
         <w:tc>
-          <w:tcPr>
-            <w:tcW w:w="4951" w:type="dxa"/>
-            <w:tcBorders>
-              <w:top w:val="single" w:sz="4" w:space="0" w:color="auto"/>
-              <w:left w:val="single" w:sz="4" w:space="0" w:color="auto"/>
-              <w:bottom w:val="single" w:sz="4" w:space="0" w:color="auto"/>
-              <w:right w:val="single" w:sz="4" w:space="0" w:color="auto"/>
-            </w:tcBorders>
-            <w:tcMar>
-              <w:top w:w="0" w:type="dxa"/>
-              <w:left w:w="108" w:type="dxa"/>
-              <w:bottom w:w="0" w:type="dxa"/>
-              <w:right w:w="108" w:type="dxa"/>
-            </w:tcMar>
-          </w:tcPr>
           <w:p>
-            <w:pPr>
-              <w:spacing w:after="200" w:line="276" w:lineRule="auto"/>
-            </w:pPr>
-          </w:p>
-        </w:tc>
-        <w:tc>
-          <w:tcPr>
-            <w:tcW w:w="851" w:type="dxa"/>
-            <w:tcBorders>
-              <w:top w:val="single" w:sz="4" w:space="0" w:color="auto"/>
-              <w:left w:val="single" w:sz="4" w:space="0" w:color="auto"/>
-              <w:bottom w:val="single" w:sz="4" w:space="0" w:color="auto"/>
-              <w:right w:val="single" w:sz="4" w:space="0" w:color="auto"/>
-            </w:tcBorders>
-            <w:tcMar>
-              <w:top w:w="0" w:type="dxa"/>
-              <w:left w:w="108" w:type="dxa"/>
-              <w:bottom w:w="0" w:type="dxa"/>
-              <w:right w:w="108" w:type="dxa"/>
-            </w:tcMar>
-          </w:tcPr>
-          <w:p>
-            <w:pPr>
-              <w:spacing w:after="200" w:line="276" w:lineRule="auto"/>
-            </w:pPr>
             <w:r>
-              <w:rPr>
-                <w:rFonts w:ascii="Calibri" w:hAnsi="Calibri" w:eastAsia="ＭＳ 明朝" w:cs="Calibri" w:eastAsiaTheme="minorEastAsia" w:csTheme="minorBidi"/>
-                <w:sz w:val="22"/>
-                <w:szCs w:val="22"/>
-              </w:rPr>
-              <w:t>Complete/</w:t>
-            </w:r>
-          </w:p>
-          <w:p>
-            <w:pPr>
-              <w:spacing w:after="200" w:line="276" w:lineRule="auto"/>
-            </w:pPr>
-            <w:r>
-              <w:rPr>
-                <w:rFonts w:ascii="Calibri" w:hAnsi="Calibri" w:eastAsia="ＭＳ 明朝" w:cs="Calibri" w:eastAsiaTheme="minorEastAsia" w:csTheme="minorBidi"/>
-                <w:sz w:val="22"/>
-                <w:szCs w:val="22"/>
-              </w:rPr>
-              <w:t>Absent</w:t>
+              <w:t>resources/views/; resources/css/app.css; resources/views/layouts/navbar.blade.php; resources/views/layouts/footer.blade.php</w:t>
             </w:r>
           </w:p>
         </w:tc>
         <w:tc>
-          <w:tcPr>
-            <w:tcW w:w="951" w:type="dxa"/>
-            <w:tcBorders>
-              <w:top w:val="single" w:sz="4" w:space="0" w:color="auto"/>
-              <w:left w:val="single" w:sz="4" w:space="0" w:color="auto"/>
-              <w:bottom w:val="single" w:sz="4" w:space="0" w:color="auto"/>
-              <w:right w:val="single" w:sz="4" w:space="0" w:color="auto"/>
-            </w:tcBorders>
-            <w:tcMar>
-              <w:top w:w="0" w:type="dxa"/>
-              <w:left w:w="108" w:type="dxa"/>
-              <w:bottom w:w="0" w:type="dxa"/>
-              <w:right w:w="108" w:type="dxa"/>
-            </w:tcMar>
-          </w:tcPr>
           <w:p>
-            <w:pPr>
-              <w:spacing w:after="200" w:line="276" w:lineRule="auto"/>
-            </w:pPr>
             <w:r>
               <w:rPr>
-                <w:rFonts w:ascii="Calibri" w:hAnsi="Calibri" w:eastAsia="ＭＳ 明朝" w:cs="Calibri" w:eastAsiaTheme="minorEastAsia" w:csTheme="minorBidi"/>
-                <w:sz w:val="22"/>
-                <w:szCs w:val="22"/>
+                <w:b/>
+                <w:bCs/>
               </w:rPr>
+              <w:t>Complete</w:t>
+            </w:r>
+          </w:p>
+        </w:tc>
+        <w:tc>
+          <w:p>
+            <w:r>
               <w:t>+0.05</w:t>
             </w:r>
           </w:p>
@@ -2019,159 +678,40 @@
       </w:tr>
       <w:tr>
         <w:tc>
-          <w:tcPr>
-            <w:tcW w:w="444" w:type="dxa"/>
-            <w:tcBorders>
-              <w:top w:val="single" w:sz="4" w:space="0" w:color="auto"/>
-              <w:left w:val="single" w:sz="4" w:space="0" w:color="auto"/>
-              <w:bottom w:val="single" w:sz="4" w:space="0" w:color="auto"/>
-              <w:right w:val="single" w:sz="4" w:space="0" w:color="auto"/>
-            </w:tcBorders>
-            <w:tcMar>
-              <w:top w:w="0" w:type="dxa"/>
-              <w:left w:w="108" w:type="dxa"/>
-              <w:bottom w:w="0" w:type="dxa"/>
-              <w:right w:w="108" w:type="dxa"/>
-            </w:tcMar>
-          </w:tcPr>
           <w:p>
-            <w:pPr>
-              <w:spacing w:after="200" w:line="276" w:lineRule="auto"/>
-            </w:pPr>
             <w:r>
-              <w:rPr>
-                <w:rFonts w:ascii="Calibri" w:hAnsi="Calibri" w:eastAsia="ＭＳ 明朝" w:cs="Calibri" w:eastAsiaTheme="minorEastAsia" w:csTheme="minorBidi"/>
-                <w:sz w:val="22"/>
-                <w:szCs w:val="22"/>
-              </w:rPr>
               <w:t>9</w:t>
             </w:r>
           </w:p>
         </w:tc>
         <w:tc>
-          <w:tcPr>
-            <w:tcW w:w="1659" w:type="dxa"/>
-            <w:tcBorders>
-              <w:top w:val="single" w:sz="4" w:space="0" w:color="auto"/>
-              <w:left w:val="single" w:sz="4" w:space="0" w:color="auto"/>
-              <w:bottom w:val="single" w:sz="4" w:space="0" w:color="auto"/>
-              <w:right w:val="single" w:sz="4" w:space="0" w:color="auto"/>
-            </w:tcBorders>
-            <w:tcMar>
-              <w:top w:w="0" w:type="dxa"/>
-              <w:left w:w="108" w:type="dxa"/>
-              <w:bottom w:w="0" w:type="dxa"/>
-              <w:right w:w="108" w:type="dxa"/>
-            </w:tcMar>
-          </w:tcPr>
           <w:p>
-            <w:pPr>
-              <w:spacing w:after="200" w:line="276" w:lineRule="auto"/>
-            </w:pPr>
             <w:r>
-              <w:rPr>
-                <w:rFonts w:ascii="Calibri" w:hAnsi="Calibri" w:eastAsia="ＭＳ 明朝" w:cs="Calibri" w:eastAsiaTheme="minorEastAsia" w:csTheme="minorBidi"/>
-                <w:sz w:val="22"/>
-                <w:szCs w:val="22"/>
-              </w:rPr>
               <w:t>4th related table</w:t>
             </w:r>
           </w:p>
         </w:tc>
         <w:tc>
-          <w:tcPr>
-            <w:tcW w:w="4951" w:type="dxa"/>
-            <w:tcBorders>
-              <w:top w:val="single" w:sz="4" w:space="0" w:color="auto"/>
-              <w:left w:val="single" w:sz="4" w:space="0" w:color="auto"/>
-              <w:bottom w:val="single" w:sz="4" w:space="0" w:color="auto"/>
-              <w:right w:val="single" w:sz="4" w:space="0" w:color="auto"/>
-            </w:tcBorders>
-            <w:tcMar>
-              <w:top w:w="0" w:type="dxa"/>
-              <w:left w:w="108" w:type="dxa"/>
-              <w:bottom w:w="0" w:type="dxa"/>
-              <w:right w:w="108" w:type="dxa"/>
-            </w:tcMar>
-          </w:tcPr>
           <w:p>
-            <w:pPr>
-              <w:spacing w:after="200" w:line="276" w:lineRule="auto"/>
-            </w:pPr>
             <w:r>
-              <w:t>planned</w:t>
+              <w:t>app/Models/Genre.php; database/migrations/*create_genres_table.php</w:t>
             </w:r>
           </w:p>
         </w:tc>
         <w:tc>
-          <w:tcPr>
-            <w:tcW w:w="851" w:type="dxa"/>
-            <w:tcBorders>
-              <w:top w:val="single" w:sz="4" w:space="0" w:color="auto"/>
-              <w:left w:val="single" w:sz="4" w:space="0" w:color="auto"/>
-              <w:bottom w:val="single" w:sz="4" w:space="0" w:color="auto"/>
-              <w:right w:val="single" w:sz="4" w:space="0" w:color="auto"/>
-            </w:tcBorders>
-            <w:tcMar>
-              <w:top w:w="0" w:type="dxa"/>
-              <w:left w:w="108" w:type="dxa"/>
-              <w:bottom w:w="0" w:type="dxa"/>
-              <w:right w:w="108" w:type="dxa"/>
-            </w:tcMar>
-          </w:tcPr>
           <w:p>
-            <w:pPr>
-              <w:spacing w:after="200" w:line="276" w:lineRule="auto"/>
-            </w:pPr>
             <w:r>
               <w:rPr>
-                <w:rFonts w:ascii="Calibri" w:hAnsi="Calibri" w:eastAsia="ＭＳ 明朝" w:cs="Calibri" w:eastAsiaTheme="minorEastAsia" w:csTheme="minorBidi"/>
-                <w:sz w:val="22"/>
-                <w:szCs w:val="22"/>
+                <w:b/>
+                <w:bCs/>
               </w:rPr>
-              <w:t>Complete/</w:t>
-            </w:r>
-          </w:p>
-          <w:p>
-            <w:pPr>
-              <w:spacing w:after="200" w:line="276" w:lineRule="auto"/>
-            </w:pPr>
-            <w:r>
-              <w:rPr>
-                <w:rFonts w:ascii="Calibri" w:hAnsi="Calibri" w:eastAsia="ＭＳ 明朝" w:cs="Calibri" w:eastAsiaTheme="minorEastAsia" w:csTheme="minorBidi"/>
-                <w:sz w:val="22"/>
-                <w:szCs w:val="22"/>
-              </w:rPr>
-              <w:t>Absent</w:t>
+              <w:t>Complete</w:t>
             </w:r>
           </w:p>
         </w:tc>
         <w:tc>
-          <w:tcPr>
-            <w:tcW w:w="951" w:type="dxa"/>
-            <w:tcBorders>
-              <w:top w:val="single" w:sz="4" w:space="0" w:color="auto"/>
-              <w:left w:val="single" w:sz="4" w:space="0" w:color="auto"/>
-              <w:bottom w:val="single" w:sz="4" w:space="0" w:color="auto"/>
-              <w:right w:val="single" w:sz="4" w:space="0" w:color="auto"/>
-            </w:tcBorders>
-            <w:tcMar>
-              <w:top w:w="0" w:type="dxa"/>
-              <w:left w:w="108" w:type="dxa"/>
-              <w:bottom w:w="0" w:type="dxa"/>
-              <w:right w:w="108" w:type="dxa"/>
-            </w:tcMar>
-          </w:tcPr>
           <w:p>
-            <w:pPr>
-              <w:spacing w:after="200" w:line="276" w:lineRule="auto"/>
-            </w:pPr>
             <w:r>
-              <w:rPr>
-                <w:rFonts w:ascii="Calibri" w:hAnsi="Calibri" w:eastAsia="ＭＳ 明朝" w:cs="Calibri" w:eastAsiaTheme="minorEastAsia" w:csTheme="minorBidi"/>
-                <w:sz w:val="22"/>
-                <w:szCs w:val="22"/>
-              </w:rPr>
               <w:t>+0.03</w:t>
             </w:r>
           </w:p>
@@ -2179,316 +719,81 @@
       </w:tr>
       <w:tr>
         <w:tc>
-          <w:tcPr>
-            <w:tcW w:w="444" w:type="dxa"/>
-            <w:tcBorders>
-              <w:top w:val="single" w:sz="4" w:space="0" w:color="auto"/>
-              <w:left w:val="single" w:sz="4" w:space="0" w:color="auto"/>
-              <w:bottom w:val="single" w:sz="4" w:space="0" w:color="auto"/>
-              <w:right w:val="single" w:sz="4" w:space="0" w:color="auto"/>
-            </w:tcBorders>
-            <w:tcMar>
-              <w:top w:w="0" w:type="dxa"/>
-              <w:left w:w="108" w:type="dxa"/>
-              <w:bottom w:w="0" w:type="dxa"/>
-              <w:right w:w="108" w:type="dxa"/>
-            </w:tcMar>
-          </w:tcPr>
           <w:p>
-            <w:pPr>
-              <w:spacing w:after="200" w:line="276" w:lineRule="auto"/>
-            </w:pPr>
             <w:r>
-              <w:rPr>
-                <w:rFonts w:ascii="Calibri" w:hAnsi="Calibri" w:eastAsia="ＭＳ 明朝" w:cs="Calibri" w:eastAsiaTheme="minorEastAsia" w:csTheme="minorBidi"/>
-                <w:sz w:val="22"/>
-                <w:szCs w:val="22"/>
-              </w:rPr>
               <w:t>10</w:t>
             </w:r>
           </w:p>
         </w:tc>
         <w:tc>
-          <w:tcPr>
-            <w:tcW w:w="1659" w:type="dxa"/>
-            <w:tcBorders>
-              <w:top w:val="single" w:sz="4" w:space="0" w:color="auto"/>
-              <w:left w:val="single" w:sz="4" w:space="0" w:color="auto"/>
-              <w:bottom w:val="single" w:sz="4" w:space="0" w:color="auto"/>
-              <w:right w:val="single" w:sz="4" w:space="0" w:color="auto"/>
-            </w:tcBorders>
-            <w:tcMar>
-              <w:top w:w="0" w:type="dxa"/>
-              <w:left w:w="108" w:type="dxa"/>
-              <w:bottom w:w="0" w:type="dxa"/>
-              <w:right w:w="108" w:type="dxa"/>
-            </w:tcMar>
-          </w:tcPr>
           <w:p>
-            <w:pPr>
-              <w:spacing w:after="200" w:line="276" w:lineRule="auto"/>
-            </w:pPr>
             <w:r>
-              <w:rPr>
-                <w:rFonts w:ascii="Calibri" w:hAnsi="Calibri" w:eastAsia="ＭＳ 明朝" w:cs="Calibri" w:eastAsiaTheme="minorEastAsia" w:csTheme="minorBidi"/>
-                <w:sz w:val="22"/>
-                <w:szCs w:val="22"/>
-              </w:rPr>
-              <w:t xml:space="preserve">5th related table </w:t>
+              <w:t>5th related table</w:t>
             </w:r>
           </w:p>
         </w:tc>
         <w:tc>
-          <w:tcPr>
-            <w:tcW w:w="4951" w:type="dxa"/>
-            <w:tcBorders>
-              <w:top w:val="single" w:sz="4" w:space="0" w:color="auto"/>
-              <w:left w:val="single" w:sz="4" w:space="0" w:color="auto"/>
-              <w:bottom w:val="single" w:sz="4" w:space="0" w:color="auto"/>
-              <w:right w:val="single" w:sz="4" w:space="0" w:color="auto"/>
-            </w:tcBorders>
-            <w:tcMar>
-              <w:top w:w="0" w:type="dxa"/>
-              <w:left w:w="108" w:type="dxa"/>
-              <w:bottom w:w="0" w:type="dxa"/>
-              <w:right w:w="108" w:type="dxa"/>
-            </w:tcMar>
-          </w:tcPr>
           <w:p>
-            <w:pPr>
-              <w:spacing w:after="200" w:line="276" w:lineRule="auto"/>
-            </w:pPr>
+            <w:r>
+              <w:t>Not implemented</w:t>
+            </w:r>
           </w:p>
         </w:tc>
         <w:tc>
-          <w:tcPr>
-            <w:tcW w:w="851" w:type="dxa"/>
-            <w:tcBorders>
-              <w:top w:val="single" w:sz="4" w:space="0" w:color="auto"/>
-              <w:left w:val="single" w:sz="4" w:space="0" w:color="auto"/>
-              <w:bottom w:val="single" w:sz="4" w:space="0" w:color="auto"/>
-              <w:right w:val="single" w:sz="4" w:space="0" w:color="auto"/>
-            </w:tcBorders>
-            <w:tcMar>
-              <w:top w:w="0" w:type="dxa"/>
-              <w:left w:w="108" w:type="dxa"/>
-              <w:bottom w:w="0" w:type="dxa"/>
-              <w:right w:w="108" w:type="dxa"/>
-            </w:tcMar>
-          </w:tcPr>
           <w:p>
-            <w:pPr>
-              <w:spacing w:after="200" w:line="276" w:lineRule="auto"/>
-            </w:pPr>
             <w:r>
               <w:rPr>
-                <w:rFonts w:ascii="Calibri" w:hAnsi="Calibri" w:eastAsia="ＭＳ 明朝" w:cs="Calibri" w:eastAsiaTheme="minorEastAsia" w:csTheme="minorBidi"/>
-                <w:sz w:val="22"/>
-                <w:szCs w:val="22"/>
-              </w:rPr>
-              <w:t>Complete/</w:t>
-            </w:r>
-          </w:p>
-          <w:p>
-            <w:pPr>
-              <w:spacing w:after="200" w:line="276" w:lineRule="auto"/>
-            </w:pPr>
-            <w:r>
-              <w:rPr>
-                <w:rFonts w:ascii="Calibri" w:hAnsi="Calibri" w:eastAsia="ＭＳ 明朝" w:cs="Calibri" w:eastAsiaTheme="minorEastAsia" w:csTheme="minorBidi"/>
-                <w:sz w:val="22"/>
-                <w:szCs w:val="22"/>
+                <w:b/>
+                <w:bCs/>
               </w:rPr>
               <w:t>Absent</w:t>
             </w:r>
           </w:p>
         </w:tc>
         <w:tc>
-          <w:tcPr>
-            <w:tcW w:w="951" w:type="dxa"/>
-            <w:tcBorders>
-              <w:top w:val="single" w:sz="4" w:space="0" w:color="auto"/>
-              <w:left w:val="single" w:sz="4" w:space="0" w:color="auto"/>
-              <w:bottom w:val="single" w:sz="4" w:space="0" w:color="auto"/>
-              <w:right w:val="single" w:sz="4" w:space="0" w:color="auto"/>
-            </w:tcBorders>
-            <w:tcMar>
-              <w:top w:w="0" w:type="dxa"/>
-              <w:left w:w="108" w:type="dxa"/>
-              <w:bottom w:w="0" w:type="dxa"/>
-              <w:right w:w="108" w:type="dxa"/>
-            </w:tcMar>
-          </w:tcPr>
           <w:p>
-            <w:pPr>
-              <w:spacing w:after="200" w:line="276" w:lineRule="auto"/>
-            </w:pPr>
             <w:r>
-              <w:rPr>
-                <w:rFonts w:ascii="Calibri" w:hAnsi="Calibri" w:eastAsia="ＭＳ 明朝" w:cs="Calibri" w:eastAsiaTheme="minorEastAsia" w:csTheme="minorBidi"/>
-                <w:sz w:val="22"/>
-                <w:szCs w:val="22"/>
-              </w:rPr>
-              <w:t>+0.03</w:t>
+              <w:t>+0</w:t>
             </w:r>
           </w:p>
         </w:tc>
       </w:tr>
       <w:tr>
         <w:tc>
-          <w:tcPr>
-            <w:tcW w:w="444" w:type="dxa"/>
-            <w:tcBorders>
-              <w:top w:val="single" w:sz="4" w:space="0" w:color="auto"/>
-              <w:left w:val="single" w:sz="4" w:space="0" w:color="auto"/>
-              <w:bottom w:val="single" w:sz="4" w:space="0" w:color="auto"/>
-              <w:right w:val="single" w:sz="4" w:space="0" w:color="auto"/>
-            </w:tcBorders>
-            <w:tcMar>
-              <w:top w:w="0" w:type="dxa"/>
-              <w:left w:w="108" w:type="dxa"/>
-              <w:bottom w:w="0" w:type="dxa"/>
-              <w:right w:w="108" w:type="dxa"/>
-            </w:tcMar>
-          </w:tcPr>
           <w:p>
-            <w:pPr>
-              <w:spacing w:after="200" w:line="276" w:lineRule="auto"/>
-            </w:pPr>
             <w:r>
-              <w:rPr>
-                <w:rFonts w:ascii="Calibri" w:hAnsi="Calibri" w:eastAsia="ＭＳ 明朝" w:cs="Calibri" w:eastAsiaTheme="minorEastAsia" w:csTheme="minorBidi"/>
-                <w:sz w:val="22"/>
-                <w:szCs w:val="22"/>
-              </w:rPr>
               <w:t>11</w:t>
             </w:r>
           </w:p>
         </w:tc>
         <w:tc>
-          <w:tcPr>
-            <w:tcW w:w="1659" w:type="dxa"/>
-            <w:tcBorders>
-              <w:top w:val="single" w:sz="4" w:space="0" w:color="auto"/>
-              <w:left w:val="single" w:sz="4" w:space="0" w:color="auto"/>
-              <w:bottom w:val="single" w:sz="4" w:space="0" w:color="auto"/>
-              <w:right w:val="single" w:sz="4" w:space="0" w:color="auto"/>
-            </w:tcBorders>
-            <w:tcMar>
-              <w:top w:w="0" w:type="dxa"/>
-              <w:left w:w="108" w:type="dxa"/>
-              <w:bottom w:w="0" w:type="dxa"/>
-              <w:right w:w="108" w:type="dxa"/>
-            </w:tcMar>
-          </w:tcPr>
           <w:p>
-            <w:pPr>
-              <w:spacing w:after="200" w:line="276" w:lineRule="auto"/>
-            </w:pPr>
             <w:r>
-              <w:rPr>
-                <w:rFonts w:ascii="Calibri" w:hAnsi="Calibri" w:eastAsia="ＭＳ 明朝" w:cs="Calibri" w:eastAsiaTheme="minorEastAsia" w:csTheme="minorBidi"/>
-                <w:sz w:val="22"/>
-                <w:szCs w:val="22"/>
-              </w:rPr>
               <w:t>Many-to-many via a pivot table</w:t>
             </w:r>
           </w:p>
         </w:tc>
         <w:tc>
-          <w:tcPr>
-            <w:tcW w:w="4951" w:type="dxa"/>
-            <w:tcBorders>
-              <w:top w:val="single" w:sz="4" w:space="0" w:color="auto"/>
-              <w:left w:val="single" w:sz="4" w:space="0" w:color="auto"/>
-              <w:bottom w:val="single" w:sz="4" w:space="0" w:color="auto"/>
-              <w:right w:val="single" w:sz="4" w:space="0" w:color="auto"/>
-            </w:tcBorders>
-            <w:tcMar>
-              <w:top w:w="0" w:type="dxa"/>
-              <w:left w:w="108" w:type="dxa"/>
-              <w:bottom w:w="0" w:type="dxa"/>
-              <w:right w:w="108" w:type="dxa"/>
-            </w:tcMar>
-          </w:tcPr>
           <w:p>
-            <w:pPr>
-              <w:spacing w:after="200" w:line="276" w:lineRule="auto"/>
-            </w:pPr>
             <w:r>
-              <w:t>planned</w:t>
+              <w:t>app/Models/Movie.php; app/Models/Genre.php; database/migrations/*create_movie_genre_table.php</w:t>
             </w:r>
           </w:p>
         </w:tc>
         <w:tc>
-          <w:tcPr>
-            <w:tcW w:w="851" w:type="dxa"/>
-            <w:tcBorders>
-              <w:top w:val="single" w:sz="4" w:space="0" w:color="auto"/>
-              <w:left w:val="single" w:sz="4" w:space="0" w:color="auto"/>
-              <w:bottom w:val="single" w:sz="4" w:space="0" w:color="auto"/>
-              <w:right w:val="single" w:sz="4" w:space="0" w:color="auto"/>
-            </w:tcBorders>
-            <w:tcMar>
-              <w:top w:w="0" w:type="dxa"/>
-              <w:left w:w="108" w:type="dxa"/>
-              <w:bottom w:w="0" w:type="dxa"/>
-              <w:right w:w="108" w:type="dxa"/>
-            </w:tcMar>
-          </w:tcPr>
           <w:p>
-            <w:pPr>
-              <w:spacing w:after="200" w:line="276" w:lineRule="auto"/>
-            </w:pPr>
             <w:r>
               <w:rPr>
-                <w:rFonts w:ascii="Calibri" w:hAnsi="Calibri" w:eastAsia="ＭＳ 明朝" w:cs="Calibri" w:eastAsiaTheme="minorEastAsia" w:csTheme="minorBidi"/>
-                <w:sz w:val="22"/>
-                <w:szCs w:val="22"/>
+                <w:b/>
+                <w:bCs/>
               </w:rPr>
-              <w:t>Complete/</w:t>
-            </w:r>
-          </w:p>
-          <w:p>
-            <w:pPr>
-              <w:spacing w:after="200" w:line="276" w:lineRule="auto"/>
-            </w:pPr>
-            <w:r>
-              <w:rPr>
-                <w:rFonts w:ascii="Calibri" w:hAnsi="Calibri" w:eastAsia="ＭＳ 明朝" w:cs="Calibri" w:eastAsiaTheme="minorEastAsia" w:csTheme="minorBidi"/>
-                <w:sz w:val="22"/>
-                <w:szCs w:val="22"/>
-              </w:rPr>
-              <w:t>Absent</w:t>
+              <w:t>Complete</w:t>
             </w:r>
           </w:p>
         </w:tc>
         <w:tc>
-          <w:tcPr>
-            <w:tcW w:w="951" w:type="dxa"/>
-            <w:tcBorders>
-              <w:top w:val="single" w:sz="4" w:space="0" w:color="auto"/>
-              <w:left w:val="single" w:sz="4" w:space="0" w:color="auto"/>
-              <w:bottom w:val="single" w:sz="4" w:space="0" w:color="auto"/>
-              <w:right w:val="single" w:sz="4" w:space="0" w:color="auto"/>
-            </w:tcBorders>
-            <w:tcMar>
-              <w:top w:w="0" w:type="dxa"/>
-              <w:left w:w="108" w:type="dxa"/>
-              <w:bottom w:w="0" w:type="dxa"/>
-              <w:right w:w="108" w:type="dxa"/>
-            </w:tcMar>
-          </w:tcPr>
           <w:p>
-            <w:pPr>
-              <w:spacing w:after="200" w:line="276" w:lineRule="auto"/>
-            </w:pPr>
             <w:r>
-              <w:rPr>
-                <w:rFonts w:ascii="Calibri" w:hAnsi="Calibri" w:eastAsia="ＭＳ 明朝" w:cs="Calibri" w:eastAsiaTheme="minorEastAsia" w:csTheme="minorBidi"/>
-                <w:sz w:val="22"/>
-                <w:szCs w:val="22"/>
-              </w:rPr>
               <w:t>+0.07</w:t>
             </w:r>
           </w:p>
@@ -2496,159 +801,40 @@
       </w:tr>
       <w:tr>
         <w:tc>
-          <w:tcPr>
-            <w:tcW w:w="444" w:type="dxa"/>
-            <w:tcBorders>
-              <w:top w:val="single" w:sz="4" w:space="0" w:color="auto"/>
-              <w:left w:val="single" w:sz="4" w:space="0" w:color="auto"/>
-              <w:bottom w:val="single" w:sz="4" w:space="0" w:color="auto"/>
-              <w:right w:val="single" w:sz="4" w:space="0" w:color="auto"/>
-            </w:tcBorders>
-            <w:tcMar>
-              <w:top w:w="0" w:type="dxa"/>
-              <w:left w:w="108" w:type="dxa"/>
-              <w:bottom w:w="0" w:type="dxa"/>
-              <w:right w:w="108" w:type="dxa"/>
-            </w:tcMar>
-          </w:tcPr>
           <w:p>
-            <w:pPr>
-              <w:spacing w:after="200" w:line="276" w:lineRule="auto"/>
-            </w:pPr>
             <w:r>
-              <w:rPr>
-                <w:rFonts w:ascii="Calibri" w:hAnsi="Calibri" w:eastAsia="ＭＳ 明朝" w:cs="Calibri" w:eastAsiaTheme="minorEastAsia" w:csTheme="minorBidi"/>
-                <w:sz w:val="22"/>
-                <w:szCs w:val="22"/>
-              </w:rPr>
               <w:t>12</w:t>
             </w:r>
           </w:p>
         </w:tc>
         <w:tc>
-          <w:tcPr>
-            <w:tcW w:w="1659" w:type="dxa"/>
-            <w:tcBorders>
-              <w:top w:val="single" w:sz="4" w:space="0" w:color="auto"/>
-              <w:left w:val="single" w:sz="4" w:space="0" w:color="auto"/>
-              <w:bottom w:val="single" w:sz="4" w:space="0" w:color="auto"/>
-              <w:right w:val="single" w:sz="4" w:space="0" w:color="auto"/>
-            </w:tcBorders>
-            <w:tcMar>
-              <w:top w:w="0" w:type="dxa"/>
-              <w:left w:w="108" w:type="dxa"/>
-              <w:bottom w:w="0" w:type="dxa"/>
-              <w:right w:w="108" w:type="dxa"/>
-            </w:tcMar>
-          </w:tcPr>
           <w:p>
-            <w:pPr>
-              <w:spacing w:after="200" w:line="276" w:lineRule="auto"/>
-            </w:pPr>
             <w:r>
-              <w:rPr>
-                <w:rFonts w:ascii="Calibri" w:hAnsi="Calibri" w:eastAsia="ＭＳ 明朝" w:cs="Calibri" w:eastAsiaTheme="minorEastAsia" w:csTheme="minorBidi"/>
-                <w:sz w:val="22"/>
-                <w:szCs w:val="22"/>
-              </w:rPr>
               <w:t>Roles + middleware</w:t>
             </w:r>
           </w:p>
         </w:tc>
         <w:tc>
-          <w:tcPr>
-            <w:tcW w:w="4951" w:type="dxa"/>
-            <w:tcBorders>
-              <w:top w:val="single" w:sz="4" w:space="0" w:color="auto"/>
-              <w:left w:val="single" w:sz="4" w:space="0" w:color="auto"/>
-              <w:bottom w:val="single" w:sz="4" w:space="0" w:color="auto"/>
-              <w:right w:val="single" w:sz="4" w:space="0" w:color="auto"/>
-            </w:tcBorders>
-            <w:tcMar>
-              <w:top w:w="0" w:type="dxa"/>
-              <w:left w:w="108" w:type="dxa"/>
-              <w:bottom w:w="0" w:type="dxa"/>
-              <w:right w:w="108" w:type="dxa"/>
-            </w:tcMar>
-          </w:tcPr>
           <w:p>
-            <w:pPr>
-              <w:spacing w:after="200" w:line="276" w:lineRule="auto"/>
-            </w:pPr>
             <w:r>
-              <w:t>planned</w:t>
+              <w:t>app/Http/Middleware/AdminMiddleware.php; bootstrap/app.php; app/Models/User.php; routes/web.php</w:t>
             </w:r>
           </w:p>
         </w:tc>
         <w:tc>
-          <w:tcPr>
-            <w:tcW w:w="851" w:type="dxa"/>
-            <w:tcBorders>
-              <w:top w:val="single" w:sz="4" w:space="0" w:color="auto"/>
-              <w:left w:val="single" w:sz="4" w:space="0" w:color="auto"/>
-              <w:bottom w:val="single" w:sz="4" w:space="0" w:color="auto"/>
-              <w:right w:val="single" w:sz="4" w:space="0" w:color="auto"/>
-            </w:tcBorders>
-            <w:tcMar>
-              <w:top w:w="0" w:type="dxa"/>
-              <w:left w:w="108" w:type="dxa"/>
-              <w:bottom w:w="0" w:type="dxa"/>
-              <w:right w:w="108" w:type="dxa"/>
-            </w:tcMar>
-          </w:tcPr>
           <w:p>
-            <w:pPr>
-              <w:spacing w:after="200" w:line="276" w:lineRule="auto"/>
-            </w:pPr>
             <w:r>
               <w:rPr>
-                <w:rFonts w:ascii="Calibri" w:hAnsi="Calibri" w:eastAsia="ＭＳ 明朝" w:cs="Calibri" w:eastAsiaTheme="minorEastAsia" w:csTheme="minorBidi"/>
-                <w:sz w:val="22"/>
-                <w:szCs w:val="22"/>
+                <w:b/>
+                <w:bCs/>
               </w:rPr>
-              <w:t>Complete/</w:t>
-            </w:r>
-          </w:p>
-          <w:p>
-            <w:pPr>
-              <w:spacing w:after="200" w:line="276" w:lineRule="auto"/>
-            </w:pPr>
-            <w:r>
-              <w:rPr>
-                <w:rFonts w:ascii="Calibri" w:hAnsi="Calibri" w:eastAsia="ＭＳ 明朝" w:cs="Calibri" w:eastAsiaTheme="minorEastAsia" w:csTheme="minorBidi"/>
-                <w:sz w:val="22"/>
-                <w:szCs w:val="22"/>
-              </w:rPr>
-              <w:t>Absent</w:t>
+              <w:t>Complete</w:t>
             </w:r>
           </w:p>
         </w:tc>
         <w:tc>
-          <w:tcPr>
-            <w:tcW w:w="951" w:type="dxa"/>
-            <w:tcBorders>
-              <w:top w:val="single" w:sz="4" w:space="0" w:color="auto"/>
-              <w:left w:val="single" w:sz="4" w:space="0" w:color="auto"/>
-              <w:bottom w:val="single" w:sz="4" w:space="0" w:color="auto"/>
-              <w:right w:val="single" w:sz="4" w:space="0" w:color="auto"/>
-            </w:tcBorders>
-            <w:tcMar>
-              <w:top w:w="0" w:type="dxa"/>
-              <w:left w:w="108" w:type="dxa"/>
-              <w:bottom w:w="0" w:type="dxa"/>
-              <w:right w:w="108" w:type="dxa"/>
-            </w:tcMar>
-          </w:tcPr>
           <w:p>
-            <w:pPr>
-              <w:spacing w:after="200" w:line="276" w:lineRule="auto"/>
-            </w:pPr>
             <w:r>
-              <w:rPr>
-                <w:rFonts w:ascii="Calibri" w:hAnsi="Calibri" w:eastAsia="ＭＳ 明朝" w:cs="Calibri" w:eastAsiaTheme="minorEastAsia" w:csTheme="minorBidi"/>
-                <w:sz w:val="22"/>
-                <w:szCs w:val="22"/>
-              </w:rPr>
               <w:t>+0.07</w:t>
             </w:r>
           </w:p>
@@ -2656,555 +842,154 @@
       </w:tr>
       <w:tr>
         <w:tc>
-          <w:tcPr>
-            <w:tcW w:w="444" w:type="dxa"/>
-            <w:tcBorders>
-              <w:top w:val="single" w:sz="4" w:space="0" w:color="auto"/>
-              <w:left w:val="single" w:sz="4" w:space="0" w:color="auto"/>
-              <w:bottom w:val="single" w:sz="4" w:space="0" w:color="auto"/>
-              <w:right w:val="single" w:sz="4" w:space="0" w:color="auto"/>
-            </w:tcBorders>
-            <w:tcMar>
-              <w:top w:w="0" w:type="dxa"/>
-              <w:left w:w="108" w:type="dxa"/>
-              <w:bottom w:w="0" w:type="dxa"/>
-              <w:right w:w="108" w:type="dxa"/>
-            </w:tcMar>
-          </w:tcPr>
           <w:p>
-            <w:pPr>
-              <w:spacing w:after="200" w:line="276" w:lineRule="auto"/>
-            </w:pPr>
             <w:r>
-              <w:rPr>
-                <w:rFonts w:ascii="Calibri" w:hAnsi="Calibri" w:eastAsia="ＭＳ 明朝" w:cs="Calibri" w:eastAsiaTheme="minorEastAsia" w:csTheme="minorBidi"/>
-                <w:sz w:val="22"/>
-                <w:szCs w:val="22"/>
-              </w:rPr>
               <w:t>13</w:t>
             </w:r>
           </w:p>
         </w:tc>
         <w:tc>
-          <w:tcPr>
-            <w:tcW w:w="1659" w:type="dxa"/>
-            <w:tcBorders>
-              <w:top w:val="single" w:sz="4" w:space="0" w:color="auto"/>
-              <w:left w:val="single" w:sz="4" w:space="0" w:color="auto"/>
-              <w:bottom w:val="single" w:sz="4" w:space="0" w:color="auto"/>
-              <w:right w:val="single" w:sz="4" w:space="0" w:color="auto"/>
-            </w:tcBorders>
-            <w:tcMar>
-              <w:top w:w="0" w:type="dxa"/>
-              <w:left w:w="108" w:type="dxa"/>
-              <w:bottom w:w="0" w:type="dxa"/>
-              <w:right w:w="108" w:type="dxa"/>
-            </w:tcMar>
-          </w:tcPr>
           <w:p>
-            <w:pPr>
-              <w:spacing w:after="200" w:line="276" w:lineRule="auto"/>
-            </w:pPr>
             <w:r>
-              <w:rPr>
-                <w:rFonts w:ascii="Calibri" w:hAnsi="Calibri" w:eastAsia="ＭＳ 明朝" w:cs="Calibri" w:eastAsiaTheme="minorEastAsia" w:csTheme="minorBidi"/>
-                <w:sz w:val="22"/>
-                <w:szCs w:val="22"/>
-              </w:rPr>
               <w:t>Asynchronous UI (AJAX/Livewire)</w:t>
             </w:r>
           </w:p>
         </w:tc>
         <w:tc>
-          <w:tcPr>
-            <w:tcW w:w="4951" w:type="dxa"/>
-            <w:tcBorders>
-              <w:top w:val="single" w:sz="4" w:space="0" w:color="auto"/>
-              <w:left w:val="single" w:sz="4" w:space="0" w:color="auto"/>
-              <w:bottom w:val="single" w:sz="4" w:space="0" w:color="auto"/>
-              <w:right w:val="single" w:sz="4" w:space="0" w:color="auto"/>
-            </w:tcBorders>
-            <w:tcMar>
-              <w:top w:w="0" w:type="dxa"/>
-              <w:left w:w="108" w:type="dxa"/>
-              <w:bottom w:w="0" w:type="dxa"/>
-              <w:right w:w="108" w:type="dxa"/>
-            </w:tcMar>
-          </w:tcPr>
           <w:p>
-            <w:pPr>
-              <w:spacing w:after="200" w:line="276" w:lineRule="auto"/>
-            </w:pPr>
+            <w:r>
+              <w:t>Not implemented</w:t>
+            </w:r>
           </w:p>
         </w:tc>
         <w:tc>
-          <w:tcPr>
-            <w:tcW w:w="851" w:type="dxa"/>
-            <w:tcBorders>
-              <w:top w:val="single" w:sz="4" w:space="0" w:color="auto"/>
-              <w:left w:val="single" w:sz="4" w:space="0" w:color="auto"/>
-              <w:bottom w:val="single" w:sz="4" w:space="0" w:color="auto"/>
-              <w:right w:val="single" w:sz="4" w:space="0" w:color="auto"/>
-            </w:tcBorders>
-            <w:tcMar>
-              <w:top w:w="0" w:type="dxa"/>
-              <w:left w:w="108" w:type="dxa"/>
-              <w:bottom w:w="0" w:type="dxa"/>
-              <w:right w:w="108" w:type="dxa"/>
-            </w:tcMar>
-          </w:tcPr>
           <w:p>
-            <w:pPr>
-              <w:spacing w:after="200" w:line="276" w:lineRule="auto"/>
-            </w:pPr>
             <w:r>
               <w:rPr>
-                <w:rFonts w:ascii="Calibri" w:hAnsi="Calibri" w:eastAsia="ＭＳ 明朝" w:cs="Calibri" w:eastAsiaTheme="minorEastAsia" w:csTheme="minorBidi"/>
-                <w:sz w:val="22"/>
-                <w:szCs w:val="22"/>
-              </w:rPr>
-              <w:t>Complete/</w:t>
-            </w:r>
-          </w:p>
-          <w:p>
-            <w:pPr>
-              <w:spacing w:after="200" w:line="276" w:lineRule="auto"/>
-            </w:pPr>
-            <w:r>
-              <w:rPr>
-                <w:rFonts w:ascii="Calibri" w:hAnsi="Calibri" w:eastAsia="ＭＳ 明朝" w:cs="Calibri" w:eastAsiaTheme="minorEastAsia" w:csTheme="minorBidi"/>
-                <w:sz w:val="22"/>
-                <w:szCs w:val="22"/>
+                <w:b/>
+                <w:bCs/>
               </w:rPr>
               <w:t>Absent</w:t>
             </w:r>
           </w:p>
         </w:tc>
         <w:tc>
-          <w:tcPr>
-            <w:tcW w:w="951" w:type="dxa"/>
-            <w:tcBorders>
-              <w:top w:val="single" w:sz="4" w:space="0" w:color="auto"/>
-              <w:left w:val="single" w:sz="4" w:space="0" w:color="auto"/>
-              <w:bottom w:val="single" w:sz="4" w:space="0" w:color="auto"/>
-              <w:right w:val="single" w:sz="4" w:space="0" w:color="auto"/>
-            </w:tcBorders>
-            <w:tcMar>
-              <w:top w:w="0" w:type="dxa"/>
-              <w:left w:w="108" w:type="dxa"/>
-              <w:bottom w:w="0" w:type="dxa"/>
-              <w:right w:w="108" w:type="dxa"/>
-            </w:tcMar>
-          </w:tcPr>
           <w:p>
-            <w:pPr>
-              <w:spacing w:after="200" w:line="276" w:lineRule="auto"/>
-            </w:pPr>
             <w:r>
-              <w:rPr>
-                <w:rFonts w:ascii="Calibri" w:hAnsi="Calibri" w:eastAsia="ＭＳ 明朝" w:cs="Calibri" w:eastAsiaTheme="minorEastAsia" w:csTheme="minorBidi"/>
-                <w:sz w:val="22"/>
-                <w:szCs w:val="22"/>
-              </w:rPr>
-              <w:t>+0.07</w:t>
+              <w:t>+0</w:t>
             </w:r>
           </w:p>
         </w:tc>
       </w:tr>
       <w:tr>
         <w:tc>
-          <w:tcPr>
-            <w:tcW w:w="444" w:type="dxa"/>
-            <w:tcBorders>
-              <w:top w:val="single" w:sz="4" w:space="0" w:color="auto"/>
-              <w:left w:val="single" w:sz="4" w:space="0" w:color="auto"/>
-              <w:bottom w:val="single" w:sz="4" w:space="0" w:color="auto"/>
-              <w:right w:val="single" w:sz="4" w:space="0" w:color="auto"/>
-            </w:tcBorders>
-            <w:tcMar>
-              <w:top w:w="0" w:type="dxa"/>
-              <w:left w:w="108" w:type="dxa"/>
-              <w:bottom w:w="0" w:type="dxa"/>
-              <w:right w:w="108" w:type="dxa"/>
-            </w:tcMar>
-          </w:tcPr>
           <w:p>
-            <w:pPr>
-              <w:spacing w:after="200" w:line="276" w:lineRule="auto"/>
-            </w:pPr>
             <w:r>
-              <w:rPr>
-                <w:rFonts w:ascii="Calibri" w:hAnsi="Calibri" w:eastAsia="ＭＳ 明朝" w:cs="Calibri" w:eastAsiaTheme="minorEastAsia" w:csTheme="minorBidi"/>
-                <w:sz w:val="22"/>
-                <w:szCs w:val="22"/>
-              </w:rPr>
               <w:t>14</w:t>
             </w:r>
           </w:p>
         </w:tc>
         <w:tc>
-          <w:tcPr>
-            <w:tcW w:w="1659" w:type="dxa"/>
-            <w:tcBorders>
-              <w:top w:val="single" w:sz="4" w:space="0" w:color="auto"/>
-              <w:left w:val="single" w:sz="4" w:space="0" w:color="auto"/>
-              <w:bottom w:val="single" w:sz="4" w:space="0" w:color="auto"/>
-              <w:right w:val="single" w:sz="4" w:space="0" w:color="auto"/>
-            </w:tcBorders>
-            <w:tcMar>
-              <w:top w:w="0" w:type="dxa"/>
-              <w:left w:w="108" w:type="dxa"/>
-              <w:bottom w:w="0" w:type="dxa"/>
-              <w:right w:w="108" w:type="dxa"/>
-            </w:tcMar>
-          </w:tcPr>
           <w:p>
-            <w:pPr>
-              <w:spacing w:after="200" w:line="276" w:lineRule="auto"/>
-            </w:pPr>
             <w:r>
-              <w:rPr>
-                <w:rFonts w:ascii="Calibri" w:hAnsi="Calibri" w:eastAsia="ＭＳ 明朝" w:cs="Calibri" w:eastAsiaTheme="minorEastAsia" w:csTheme="minorBidi"/>
-                <w:sz w:val="22"/>
-                <w:szCs w:val="22"/>
-              </w:rPr>
               <w:t>3+ passing automated feature tests</w:t>
             </w:r>
           </w:p>
         </w:tc>
         <w:tc>
-          <w:tcPr>
-            <w:tcW w:w="4951" w:type="dxa"/>
-            <w:tcBorders>
-              <w:top w:val="single" w:sz="4" w:space="0" w:color="auto"/>
-              <w:left w:val="single" w:sz="4" w:space="0" w:color="auto"/>
-              <w:bottom w:val="single" w:sz="4" w:space="0" w:color="auto"/>
-              <w:right w:val="single" w:sz="4" w:space="0" w:color="auto"/>
-            </w:tcBorders>
-            <w:tcMar>
-              <w:top w:w="0" w:type="dxa"/>
-              <w:left w:w="108" w:type="dxa"/>
-              <w:bottom w:w="0" w:type="dxa"/>
-              <w:right w:w="108" w:type="dxa"/>
-            </w:tcMar>
-          </w:tcPr>
           <w:p>
-            <w:pPr>
-              <w:spacing w:after="200" w:line="276" w:lineRule="auto"/>
-            </w:pPr>
+            <w:r>
+              <w:t>Not implemented/claimed</w:t>
+            </w:r>
           </w:p>
         </w:tc>
         <w:tc>
-          <w:tcPr>
-            <w:tcW w:w="851" w:type="dxa"/>
-            <w:tcBorders>
-              <w:top w:val="single" w:sz="4" w:space="0" w:color="auto"/>
-              <w:left w:val="single" w:sz="4" w:space="0" w:color="auto"/>
-              <w:bottom w:val="single" w:sz="4" w:space="0" w:color="auto"/>
-              <w:right w:val="single" w:sz="4" w:space="0" w:color="auto"/>
-            </w:tcBorders>
-            <w:tcMar>
-              <w:top w:w="0" w:type="dxa"/>
-              <w:left w:w="108" w:type="dxa"/>
-              <w:bottom w:w="0" w:type="dxa"/>
-              <w:right w:w="108" w:type="dxa"/>
-            </w:tcMar>
-          </w:tcPr>
           <w:p>
-            <w:pPr>
-              <w:spacing w:after="200" w:line="276" w:lineRule="auto"/>
-            </w:pPr>
             <w:r>
               <w:rPr>
-                <w:rFonts w:ascii="Calibri" w:hAnsi="Calibri" w:eastAsia="ＭＳ 明朝" w:cs="Calibri" w:eastAsiaTheme="minorEastAsia" w:csTheme="minorBidi"/>
-                <w:sz w:val="22"/>
-                <w:szCs w:val="22"/>
-              </w:rPr>
-              <w:t>Complete/</w:t>
-            </w:r>
-          </w:p>
-          <w:p>
-            <w:pPr>
-              <w:spacing w:after="200" w:line="276" w:lineRule="auto"/>
-            </w:pPr>
-            <w:r>
-              <w:rPr>
-                <w:rFonts w:ascii="Calibri" w:hAnsi="Calibri" w:eastAsia="ＭＳ 明朝" w:cs="Calibri" w:eastAsiaTheme="minorEastAsia" w:csTheme="minorBidi"/>
-                <w:sz w:val="22"/>
-                <w:szCs w:val="22"/>
+                <w:b/>
+                <w:bCs/>
               </w:rPr>
               <w:t>Absent</w:t>
             </w:r>
           </w:p>
         </w:tc>
         <w:tc>
-          <w:tcPr>
-            <w:tcW w:w="951" w:type="dxa"/>
-            <w:tcBorders>
-              <w:top w:val="single" w:sz="4" w:space="0" w:color="auto"/>
-              <w:left w:val="single" w:sz="4" w:space="0" w:color="auto"/>
-              <w:bottom w:val="single" w:sz="4" w:space="0" w:color="auto"/>
-              <w:right w:val="single" w:sz="4" w:space="0" w:color="auto"/>
-            </w:tcBorders>
-            <w:tcMar>
-              <w:top w:w="0" w:type="dxa"/>
-              <w:left w:w="108" w:type="dxa"/>
-              <w:bottom w:w="0" w:type="dxa"/>
-              <w:right w:w="108" w:type="dxa"/>
-            </w:tcMar>
-          </w:tcPr>
           <w:p>
-            <w:pPr>
-              <w:spacing w:after="200" w:line="276" w:lineRule="auto"/>
-            </w:pPr>
             <w:r>
-              <w:rPr>
-                <w:rFonts w:ascii="Calibri" w:hAnsi="Calibri" w:eastAsia="ＭＳ 明朝" w:cs="Calibri" w:eastAsiaTheme="minorEastAsia" w:csTheme="minorBidi"/>
-                <w:sz w:val="22"/>
-                <w:szCs w:val="22"/>
-              </w:rPr>
-              <w:t>+0.07</w:t>
+              <w:t>+0</w:t>
             </w:r>
           </w:p>
         </w:tc>
       </w:tr>
       <w:tr>
         <w:tc>
-          <w:tcPr>
-            <w:tcW w:w="444" w:type="dxa"/>
-            <w:tcBorders>
-              <w:top w:val="single" w:sz="4" w:space="0" w:color="auto"/>
-              <w:left w:val="single" w:sz="4" w:space="0" w:color="auto"/>
-              <w:bottom w:val="single" w:sz="4" w:space="0" w:color="auto"/>
-              <w:right w:val="single" w:sz="4" w:space="0" w:color="auto"/>
-            </w:tcBorders>
-            <w:tcMar>
-              <w:top w:w="0" w:type="dxa"/>
-              <w:left w:w="108" w:type="dxa"/>
-              <w:bottom w:w="0" w:type="dxa"/>
-              <w:right w:w="108" w:type="dxa"/>
-            </w:tcMar>
-          </w:tcPr>
           <w:p>
-            <w:pPr>
-              <w:spacing w:after="200" w:line="276" w:lineRule="auto"/>
-            </w:pPr>
             <w:r>
-              <w:rPr>
-                <w:rFonts w:ascii="Calibri" w:hAnsi="Calibri" w:eastAsia="ＭＳ 明朝" w:cs="Calibri" w:eastAsiaTheme="minorEastAsia" w:csTheme="minorBidi"/>
-                <w:sz w:val="22"/>
-                <w:szCs w:val="22"/>
-              </w:rPr>
               <w:t>15</w:t>
             </w:r>
           </w:p>
         </w:tc>
         <w:tc>
-          <w:tcPr>
-            <w:tcW w:w="1659" w:type="dxa"/>
-            <w:tcBorders>
-              <w:top w:val="single" w:sz="4" w:space="0" w:color="auto"/>
-              <w:left w:val="single" w:sz="4" w:space="0" w:color="auto"/>
-              <w:bottom w:val="single" w:sz="4" w:space="0" w:color="auto"/>
-              <w:right w:val="single" w:sz="4" w:space="0" w:color="auto"/>
-            </w:tcBorders>
-            <w:tcMar>
-              <w:top w:w="0" w:type="dxa"/>
-              <w:left w:w="108" w:type="dxa"/>
-              <w:bottom w:w="0" w:type="dxa"/>
-              <w:right w:w="108" w:type="dxa"/>
-            </w:tcMar>
-          </w:tcPr>
           <w:p>
-            <w:pPr>
-              <w:spacing w:after="200" w:line="276" w:lineRule="auto"/>
-            </w:pPr>
             <w:r>
-              <w:rPr>
-                <w:rFonts w:ascii="Calibri" w:hAnsi="Calibri" w:eastAsia="ＭＳ 明朝" w:cs="Calibri" w:eastAsiaTheme="minorEastAsia" w:csTheme="minorBidi"/>
-                <w:sz w:val="22"/>
-                <w:szCs w:val="22"/>
-              </w:rPr>
-              <w:t xml:space="preserve">Third-party API </w:t>
+              <w:t>Third-party API</w:t>
             </w:r>
           </w:p>
         </w:tc>
         <w:tc>
-          <w:tcPr>
-            <w:tcW w:w="4951" w:type="dxa"/>
-            <w:tcBorders>
-              <w:top w:val="single" w:sz="4" w:space="0" w:color="auto"/>
-              <w:left w:val="single" w:sz="4" w:space="0" w:color="auto"/>
-              <w:bottom w:val="single" w:sz="4" w:space="0" w:color="auto"/>
-              <w:right w:val="single" w:sz="4" w:space="0" w:color="auto"/>
-            </w:tcBorders>
-            <w:tcMar>
-              <w:top w:w="0" w:type="dxa"/>
-              <w:left w:w="108" w:type="dxa"/>
-              <w:bottom w:w="0" w:type="dxa"/>
-              <w:right w:w="108" w:type="dxa"/>
-            </w:tcMar>
-          </w:tcPr>
           <w:p>
-            <w:pPr>
-              <w:spacing w:after="200" w:line="276" w:lineRule="auto"/>
-            </w:pPr>
             <w:r>
-              <w:t>planned</w:t>
+              <w:t>Not implemented</w:t>
             </w:r>
           </w:p>
         </w:tc>
         <w:tc>
-          <w:tcPr>
-            <w:tcW w:w="851" w:type="dxa"/>
-            <w:tcBorders>
-              <w:top w:val="single" w:sz="4" w:space="0" w:color="auto"/>
-              <w:left w:val="single" w:sz="4" w:space="0" w:color="auto"/>
-              <w:bottom w:val="single" w:sz="4" w:space="0" w:color="auto"/>
-              <w:right w:val="single" w:sz="4" w:space="0" w:color="auto"/>
-            </w:tcBorders>
-            <w:tcMar>
-              <w:top w:w="0" w:type="dxa"/>
-              <w:left w:w="108" w:type="dxa"/>
-              <w:bottom w:w="0" w:type="dxa"/>
-              <w:right w:w="108" w:type="dxa"/>
-            </w:tcMar>
-          </w:tcPr>
           <w:p>
-            <w:pPr>
-              <w:spacing w:after="200" w:line="276" w:lineRule="auto"/>
-            </w:pPr>
             <w:r>
               <w:rPr>
-                <w:rFonts w:ascii="Calibri" w:hAnsi="Calibri" w:eastAsia="ＭＳ 明朝" w:cs="Calibri" w:eastAsiaTheme="minorEastAsia" w:csTheme="minorBidi"/>
-                <w:sz w:val="22"/>
-                <w:szCs w:val="22"/>
-              </w:rPr>
-              <w:t>Complete/</w:t>
-            </w:r>
-          </w:p>
-          <w:p>
-            <w:pPr>
-              <w:spacing w:after="200" w:line="276" w:lineRule="auto"/>
-            </w:pPr>
-            <w:r>
-              <w:rPr>
-                <w:rFonts w:ascii="Calibri" w:hAnsi="Calibri" w:eastAsia="ＭＳ 明朝" w:cs="Calibri" w:eastAsiaTheme="minorEastAsia" w:csTheme="minorBidi"/>
-                <w:sz w:val="22"/>
-                <w:szCs w:val="22"/>
+                <w:b/>
+                <w:bCs/>
               </w:rPr>
               <w:t>Absent</w:t>
             </w:r>
           </w:p>
         </w:tc>
         <w:tc>
-          <w:tcPr>
-            <w:tcW w:w="951" w:type="dxa"/>
-            <w:tcBorders>
-              <w:top w:val="single" w:sz="4" w:space="0" w:color="auto"/>
-              <w:left w:val="single" w:sz="4" w:space="0" w:color="auto"/>
-              <w:bottom w:val="single" w:sz="4" w:space="0" w:color="auto"/>
-              <w:right w:val="single" w:sz="4" w:space="0" w:color="auto"/>
-            </w:tcBorders>
-            <w:tcMar>
-              <w:top w:w="0" w:type="dxa"/>
-              <w:left w:w="108" w:type="dxa"/>
-              <w:bottom w:w="0" w:type="dxa"/>
-              <w:right w:w="108" w:type="dxa"/>
-            </w:tcMar>
-          </w:tcPr>
           <w:p>
-            <w:pPr>
-              <w:spacing w:after="200" w:line="276" w:lineRule="auto"/>
-            </w:pPr>
             <w:r>
-              <w:rPr>
-                <w:rFonts w:ascii="Calibri" w:hAnsi="Calibri" w:eastAsia="ＭＳ 明朝" w:cs="Calibri" w:eastAsiaTheme="minorEastAsia" w:csTheme="minorBidi"/>
-                <w:sz w:val="22"/>
-                <w:szCs w:val="22"/>
-              </w:rPr>
-              <w:t>+0.08</w:t>
+              <w:t>+0</w:t>
             </w:r>
-          </w:p>
-        </w:tc>
-      </w:tr>
-      <w:tr>
-        <w:tc>
-          <w:tcPr>
-            <w:tcW w:w="7054" w:type="dxa"/>
-            <w:gridSpan w:val="3"/>
-            <w:tcBorders>
-              <w:top w:val="single" w:sz="4" w:space="0" w:color="auto"/>
-              <w:left w:val="single" w:sz="4" w:space="0" w:color="auto"/>
-              <w:bottom w:val="single" w:sz="4" w:space="0" w:color="auto"/>
-              <w:right w:val="single" w:sz="4" w:space="0" w:color="auto"/>
-            </w:tcBorders>
-            <w:tcMar>
-              <w:top w:w="0" w:type="dxa"/>
-              <w:left w:w="108" w:type="dxa"/>
-              <w:bottom w:w="0" w:type="dxa"/>
-              <w:right w:w="108" w:type="dxa"/>
-            </w:tcMar>
-          </w:tcPr>
-          <w:p>
-            <w:pPr>
-              <w:spacing w:after="200" w:line="276" w:lineRule="auto"/>
-            </w:pPr>
-            <w:r>
-              <w:rPr>
-                <w:rFonts w:ascii="Calibri" w:hAnsi="Calibri" w:eastAsia="ＭＳ 明朝" w:cs="Calibri" w:eastAsiaTheme="minorEastAsia" w:csTheme="minorBidi"/>
-                <w:sz w:val="22"/>
-                <w:szCs w:val="22"/>
-              </w:rPr>
-              <w:t>Total</w:t>
-            </w:r>
-            <w:r>
-              <w:rPr>
-                <w:rFonts w:ascii="Calibri" w:hAnsi="Calibri" w:eastAsia="ＭＳ 明朝" w:cs="Calibri" w:eastAsiaTheme="minorEastAsia" w:csTheme="minorBidi"/>
-                <w:sz w:val="22"/>
-                <w:szCs w:val="22"/>
-              </w:rPr>
-              <w:t xml:space="preserve"> </w:t>
-            </w:r>
-            <w:r>
-              <w:rPr>
-                <w:rFonts w:ascii="Calibri" w:hAnsi="Calibri" w:eastAsia="ＭＳ 明朝" w:cs="Calibri" w:eastAsiaTheme="minorEastAsia" w:csTheme="minorBidi"/>
-                <w:sz w:val="22"/>
-                <w:szCs w:val="22"/>
-              </w:rPr>
-              <w:t>score</w:t>
-            </w:r>
-          </w:p>
-        </w:tc>
-        <w:tc>
-          <w:tcPr>
-            <w:tcW w:w="1802" w:type="dxa"/>
-            <w:gridSpan w:val="2"/>
-            <w:tcBorders>
-              <w:top w:val="single" w:sz="4" w:space="0" w:color="auto"/>
-              <w:left w:val="single" w:sz="4" w:space="0" w:color="auto"/>
-              <w:bottom w:val="single" w:sz="4" w:space="0" w:color="auto"/>
-              <w:right w:val="single" w:sz="4" w:space="0" w:color="auto"/>
-            </w:tcBorders>
-            <w:tcMar>
-              <w:top w:w="0" w:type="dxa"/>
-              <w:left w:w="108" w:type="dxa"/>
-              <w:bottom w:w="0" w:type="dxa"/>
-              <w:right w:w="108" w:type="dxa"/>
-            </w:tcMar>
-          </w:tcPr>
-          <w:p>
-            <w:pPr>
-              <w:spacing w:after="200" w:line="276" w:lineRule="auto"/>
-            </w:pPr>
           </w:p>
         </w:tc>
       </w:tr>
     </w:tbl>
     <w:p>
+      <w:r>
+        <w:rPr>
+          <w:b/>
+          <w:bCs/>
+        </w:rPr>
+        <w:t>Feature score: 0.32</w:t>
+      </w:r>
+    </w:p>
+    <w:p>
       <w:pPr>
-        <w:spacing w:after="200" w:line="276" w:lineRule="auto"/>
+        <w:pStyle w:val="Heading3"/>
+        <w:outlineLvl w:val="2"/>
       </w:pPr>
+      <w:r>
+        <w:t>Total</w:t>
+      </w:r>
+    </w:p>
+    <w:p>
+      <w:r>
+        <w:rPr>
+          <w:b/>
+          <w:bCs/>
+        </w:rPr>
+        <w:t>Current Complexity total: 0.92</w:t>
+      </w:r>
     </w:p>
     <w:sectPr>
       <w:pgSz w:w="12240" w:h="15840"/>

</xml_diff>